<commit_message>
Revise UX UI portfolio CV
</commit_message>
<xml_diff>
--- a/output/docx/Ekaterina_Melnikova_UXUI_Designer.docx
+++ b/output/docx/Ekaterina_Melnikova_UXUI_Designer.docx
@@ -98,112 +98,6 @@
         <w:pStyle w:val="Heading1"/>
       </w:pPr>
       <w:r>
-        <w:t>Profile</w:t>
-      </w:r>
-    </w:p>
-    <w:p>
-      <w:pPr>
-        <w:spacing w:after="60"/>
-      </w:pPr>
-      <w:r>
-        <w:rPr>
-          <w:rFonts w:ascii="Aptos" w:hAnsi="Aptos"/>
-          <w:b w:val="0"/>
-          <w:i w:val="0"/>
-          <w:color w:val="000000"/>
-          <w:sz w:val="19"/>
-        </w:rPr>
-        <w:t>UX/UI Designer creating clear, intuitive interfaces for web and mobile products. I combine research, information architecture, interaction design, prototyping and design systems to simplify complex products. I am currently developing a specialization in game UX/UI.</w:t>
-      </w:r>
-    </w:p>
-    <w:p>
-      <w:pPr>
-        <w:pStyle w:val="Heading1"/>
-      </w:pPr>
-      <w:r>
-        <w:t>Core Skills</w:t>
-      </w:r>
-    </w:p>
-    <w:p>
-      <w:pPr>
-        <w:spacing w:after="40"/>
-      </w:pPr>
-      <w:r>
-        <w:rPr>
-          <w:rFonts w:ascii="Aptos" w:hAnsi="Aptos"/>
-          <w:b/>
-          <w:i w:val="0"/>
-          <w:color w:val="000000"/>
-          <w:sz w:val="19"/>
-        </w:rPr>
-        <w:t xml:space="preserve">UX: </w:t>
-      </w:r>
-      <w:r>
-        <w:rPr>
-          <w:rFonts w:ascii="Aptos" w:hAnsi="Aptos"/>
-          <w:b w:val="0"/>
-          <w:i w:val="0"/>
-          <w:color w:val="000000"/>
-          <w:sz w:val="19"/>
-        </w:rPr>
-        <w:t>user interviews, surveys, usability testing, heuristic analysis, information architecture, user flows, wireframes</w:t>
-      </w:r>
-    </w:p>
-    <w:p>
-      <w:pPr>
-        <w:spacing w:after="40"/>
-      </w:pPr>
-      <w:r>
-        <w:rPr>
-          <w:rFonts w:ascii="Aptos" w:hAnsi="Aptos"/>
-          <w:b/>
-          <w:i w:val="0"/>
-          <w:color w:val="000000"/>
-          <w:sz w:val="19"/>
-        </w:rPr>
-        <w:t xml:space="preserve">UI and interaction: </w:t>
-      </w:r>
-      <w:r>
-        <w:rPr>
-          <w:rFonts w:ascii="Aptos" w:hAnsi="Aptos"/>
-          <w:b w:val="0"/>
-          <w:i w:val="0"/>
-          <w:color w:val="000000"/>
-          <w:sz w:val="19"/>
-        </w:rPr>
-        <w:t>visual hierarchy, interaction design, responsive web and mobile UI, polished mockups, interactive prototypes</w:t>
-      </w:r>
-    </w:p>
-    <w:p>
-      <w:pPr>
-        <w:spacing w:after="40"/>
-      </w:pPr>
-      <w:r>
-        <w:rPr>
-          <w:rFonts w:ascii="Aptos" w:hAnsi="Aptos"/>
-          <w:b/>
-          <w:i w:val="0"/>
-          <w:color w:val="000000"/>
-          <w:sz w:val="19"/>
-        </w:rPr>
-        <w:t xml:space="preserve">Systems and delivery: </w:t>
-      </w:r>
-      <w:r>
-        <w:rPr>
-          <w:rFonts w:ascii="Aptos" w:hAnsi="Aptos"/>
-          <w:b w:val="0"/>
-          <w:i w:val="0"/>
-          <w:color w:val="000000"/>
-          <w:sz w:val="19"/>
-        </w:rPr>
-        <w:t>design systems, component libraries, design tokens, Figma, developer handoff, documentation, QA</w:t>
-      </w:r>
-    </w:p>
-    <w:p>
-      <w:pPr>
-        <w:pStyle w:val="Heading1"/>
-      </w:pPr>
-      <w:r>
         <w:t>Experience</w:t>
       </w:r>
     </w:p>
@@ -222,7 +116,7 @@
           <w:color w:val="000000"/>
           <w:sz w:val="20"/>
         </w:rPr>
-        <w:t>Senior Product Designer | Zhelezno</w:t>
+        <w:t>UX/UI Designer | Zhelezno</w:t>
       </w:r>
       <w:r>
         <w:rPr>
@@ -233,7 +127,7 @@
           <w:sz w:val="19"/>
         </w:rPr>
         <w:tab/>
-        <w:t>Jul 2024 - Present</w:t>
+        <w:t>Jan 2022 - Now</w:t>
       </w:r>
     </w:p>
     <w:p>
@@ -298,35 +192,6 @@
           <w:sz w:val="19"/>
         </w:rPr>
         <w:t>Mentored a junior designer and improved feature delivery time by 14%.</w:t>
-      </w:r>
-    </w:p>
-    <w:p>
-      <w:pPr>
-        <w:pStyle w:val="Role"/>
-        <w:tabs>
-          <w:tab w:pos="10368" w:val="right"/>
-        </w:tabs>
-      </w:pPr>
-      <w:r>
-        <w:rPr>
-          <w:rFonts w:ascii="Aptos" w:hAnsi="Aptos"/>
-          <w:b/>
-          <w:i w:val="0"/>
-          <w:color w:val="000000"/>
-          <w:sz w:val="20"/>
-        </w:rPr>
-        <w:t>Middle+ Product Designer | Zhelezno</w:t>
-      </w:r>
-      <w:r>
-        <w:rPr>
-          <w:rFonts w:ascii="Aptos" w:hAnsi="Aptos"/>
-          <w:b/>
-          <w:i w:val="0"/>
-          <w:color w:val="000000"/>
-          <w:sz w:val="19"/>
-        </w:rPr>
-        <w:tab/>
-        <w:t>Jan 2022 - Jul 2024</w:t>
       </w:r>
     </w:p>
     <w:p>
@@ -574,6 +439,29 @@
           <w:sz w:val="19"/>
         </w:rPr>
         <w:t>Redesigned key B2C and B2B marketplace flows, supporting adoption among 4K+ active users.</w:t>
+      </w:r>
+    </w:p>
+    <w:p>
+      <w:pPr>
+        <w:pStyle w:val="Heading1"/>
+      </w:pPr>
+      <w:r>
+        <w:t>Skills</w:t>
+      </w:r>
+    </w:p>
+    <w:p>
+      <w:pPr>
+        <w:spacing w:after="60"/>
+      </w:pPr>
+      <w:r>
+        <w:rPr>
+          <w:rFonts w:ascii="Aptos" w:hAnsi="Aptos"/>
+          <w:b w:val="0"/>
+          <w:i w:val="0"/>
+          <w:color w:val="000000"/>
+          <w:sz w:val="19"/>
+        </w:rPr>
+        <w:t>UX Design, UI Design, Interaction Design, Information Architecture, User Flows, Wireframing, Interactive Prototyping, User Research, User Interviews, Usability Testing, Responsive Design, Accessibility, Design Systems, Component Libraries, Design Tokens, Developer Handoff, Figma, FigJam, ProtoPie, Adobe Photoshop, Adobe Illustrator, ChatGPT, Claude, Codex.</w:t>
       </w:r>
     </w:p>
     <w:p>

</xml_diff>

<commit_message>
Update UX UI CV typography and section order
</commit_message>
<xml_diff>
--- a/output/docx/Ekaterina_Melnikova_UXUI_Designer.docx
+++ b/output/docx/Ekaterina_Melnikova_UXUI_Designer.docx
@@ -16,7 +16,7 @@
       </w:pPr>
       <w:r>
         <w:rPr>
-          <w:rFonts w:ascii="Aptos" w:hAnsi="Aptos"/>
+          <w:rFonts w:ascii="Arial" w:hAnsi="Arial"/>
           <w:b/>
           <w:i w:val="0"/>
           <w:color w:val="000000"/>
@@ -31,7 +31,7 @@
       </w:pPr>
       <w:r>
         <w:rPr>
-          <w:rFonts w:ascii="Aptos" w:hAnsi="Aptos"/>
+          <w:rFonts w:ascii="Arial" w:hAnsi="Arial"/>
           <w:b w:val="0"/>
           <w:i w:val="0"/>
           <w:color w:val="484848"/>
@@ -44,7 +44,7 @@
           <w:rPr>
             <w:color w:val="0F6F68"/>
             <w:u w:val="single"/>
-            <w:rFonts w:ascii="Aptos" w:hAnsi="Aptos"/>
+            <w:rFonts w:ascii="Arial" w:hAnsi="Arial"/>
             <w:sz w:val="19"/>
           </w:rPr>
           <w:t>domofeel@gmail.com</w:t>
@@ -52,7 +52,7 @@
       </w:hyperlink>
       <w:r>
         <w:rPr>
-          <w:rFonts w:ascii="Aptos" w:hAnsi="Aptos"/>
+          <w:rFonts w:ascii="Arial" w:hAnsi="Arial"/>
           <w:b w:val="0"/>
           <w:i w:val="0"/>
           <w:color w:val="484848"/>
@@ -65,7 +65,7 @@
           <w:rPr>
             <w:color w:val="0F6F68"/>
             <w:u w:val="single"/>
-            <w:rFonts w:ascii="Aptos" w:hAnsi="Aptos"/>
+            <w:rFonts w:ascii="Arial" w:hAnsi="Arial"/>
             <w:sz w:val="19"/>
           </w:rPr>
           <w:t>LinkedIn</w:t>
@@ -73,7 +73,7 @@
       </w:hyperlink>
       <w:r>
         <w:rPr>
-          <w:rFonts w:ascii="Aptos" w:hAnsi="Aptos"/>
+          <w:rFonts w:ascii="Arial" w:hAnsi="Arial"/>
           <w:b w:val="0"/>
           <w:i w:val="0"/>
           <w:color w:val="484848"/>
@@ -86,7 +86,7 @@
           <w:rPr>
             <w:color w:val="0F6F68"/>
             <w:u w:val="single"/>
-            <w:rFonts w:ascii="Aptos" w:hAnsi="Aptos"/>
+            <w:rFonts w:ascii="Arial" w:hAnsi="Arial"/>
             <w:sz w:val="19"/>
           </w:rPr>
           <w:t>Portfolio</w:t>
@@ -110,7 +110,7 @@
       </w:pPr>
       <w:r>
         <w:rPr>
-          <w:rFonts w:ascii="Aptos" w:hAnsi="Aptos"/>
+          <w:rFonts w:ascii="Arial" w:hAnsi="Arial"/>
           <w:b/>
           <w:i w:val="0"/>
           <w:color w:val="000000"/>
@@ -120,7 +120,7 @@
       </w:r>
       <w:r>
         <w:rPr>
-          <w:rFonts w:ascii="Aptos" w:hAnsi="Aptos"/>
+          <w:rFonts w:ascii="Arial" w:hAnsi="Arial"/>
           <w:b/>
           <w:i w:val="0"/>
           <w:color w:val="000000"/>
@@ -137,7 +137,7 @@
       </w:pPr>
       <w:r>
         <w:rPr>
-          <w:rFonts w:ascii="Aptos" w:hAnsi="Aptos"/>
+          <w:rFonts w:ascii="Arial" w:hAnsi="Arial"/>
           <w:b w:val="0"/>
           <w:i w:val="0"/>
           <w:color w:val="000000"/>
@@ -153,7 +153,7 @@
       </w:pPr>
       <w:r>
         <w:rPr>
-          <w:rFonts w:ascii="Aptos" w:hAnsi="Aptos"/>
+          <w:rFonts w:ascii="Arial" w:hAnsi="Arial"/>
           <w:b w:val="0"/>
           <w:i w:val="0"/>
           <w:color w:val="000000"/>
@@ -169,7 +169,7 @@
       </w:pPr>
       <w:r>
         <w:rPr>
-          <w:rFonts w:ascii="Aptos" w:hAnsi="Aptos"/>
+          <w:rFonts w:ascii="Arial" w:hAnsi="Arial"/>
           <w:b w:val="0"/>
           <w:i w:val="0"/>
           <w:color w:val="000000"/>
@@ -185,7 +185,7 @@
       </w:pPr>
       <w:r>
         <w:rPr>
-          <w:rFonts w:ascii="Aptos" w:hAnsi="Aptos"/>
+          <w:rFonts w:ascii="Arial" w:hAnsi="Arial"/>
           <w:b w:val="0"/>
           <w:i w:val="0"/>
           <w:color w:val="000000"/>
@@ -201,7 +201,7 @@
       </w:pPr>
       <w:r>
         <w:rPr>
-          <w:rFonts w:ascii="Aptos" w:hAnsi="Aptos"/>
+          <w:rFonts w:ascii="Arial" w:hAnsi="Arial"/>
           <w:b w:val="0"/>
           <w:i w:val="0"/>
           <w:color w:val="000000"/>
@@ -217,7 +217,7 @@
       </w:pPr>
       <w:r>
         <w:rPr>
-          <w:rFonts w:ascii="Aptos" w:hAnsi="Aptos"/>
+          <w:rFonts w:ascii="Arial" w:hAnsi="Arial"/>
           <w:b w:val="0"/>
           <w:i w:val="0"/>
           <w:color w:val="000000"/>
@@ -233,7 +233,7 @@
       </w:pPr>
       <w:r>
         <w:rPr>
-          <w:rFonts w:ascii="Aptos" w:hAnsi="Aptos"/>
+          <w:rFonts w:ascii="Arial" w:hAnsi="Arial"/>
           <w:b w:val="0"/>
           <w:i w:val="0"/>
           <w:color w:val="000000"/>
@@ -251,7 +251,7 @@
       </w:pPr>
       <w:r>
         <w:rPr>
-          <w:rFonts w:ascii="Aptos" w:hAnsi="Aptos"/>
+          <w:rFonts w:ascii="Arial" w:hAnsi="Arial"/>
           <w:b/>
           <w:i w:val="0"/>
           <w:color w:val="000000"/>
@@ -261,7 +261,7 @@
       </w:r>
       <w:r>
         <w:rPr>
-          <w:rFonts w:ascii="Aptos" w:hAnsi="Aptos"/>
+          <w:rFonts w:ascii="Arial" w:hAnsi="Arial"/>
           <w:b/>
           <w:i w:val="0"/>
           <w:color w:val="000000"/>
@@ -278,7 +278,7 @@
       </w:pPr>
       <w:r>
         <w:rPr>
-          <w:rFonts w:ascii="Aptos" w:hAnsi="Aptos"/>
+          <w:rFonts w:ascii="Arial" w:hAnsi="Arial"/>
           <w:b w:val="0"/>
           <w:i w:val="0"/>
           <w:color w:val="000000"/>
@@ -294,7 +294,7 @@
       </w:pPr>
       <w:r>
         <w:rPr>
-          <w:rFonts w:ascii="Aptos" w:hAnsi="Aptos"/>
+          <w:rFonts w:ascii="Arial" w:hAnsi="Arial"/>
           <w:b w:val="0"/>
           <w:i w:val="0"/>
           <w:color w:val="000000"/>
@@ -310,7 +310,7 @@
       </w:pPr>
       <w:r>
         <w:rPr>
-          <w:rFonts w:ascii="Aptos" w:hAnsi="Aptos"/>
+          <w:rFonts w:ascii="Arial" w:hAnsi="Arial"/>
           <w:b w:val="0"/>
           <w:i w:val="0"/>
           <w:color w:val="000000"/>
@@ -328,7 +328,7 @@
       </w:pPr>
       <w:r>
         <w:rPr>
-          <w:rFonts w:ascii="Aptos" w:hAnsi="Aptos"/>
+          <w:rFonts w:ascii="Arial" w:hAnsi="Arial"/>
           <w:b/>
           <w:i w:val="0"/>
           <w:color w:val="000000"/>
@@ -338,7 +338,7 @@
       </w:r>
       <w:r>
         <w:rPr>
-          <w:rFonts w:ascii="Aptos" w:hAnsi="Aptos"/>
+          <w:rFonts w:ascii="Arial" w:hAnsi="Arial"/>
           <w:b/>
           <w:i w:val="0"/>
           <w:color w:val="000000"/>
@@ -355,7 +355,7 @@
       </w:pPr>
       <w:r>
         <w:rPr>
-          <w:rFonts w:ascii="Aptos" w:hAnsi="Aptos"/>
+          <w:rFonts w:ascii="Arial" w:hAnsi="Arial"/>
           <w:b w:val="0"/>
           <w:i w:val="0"/>
           <w:color w:val="000000"/>
@@ -371,7 +371,7 @@
       </w:pPr>
       <w:r>
         <w:rPr>
-          <w:rFonts w:ascii="Aptos" w:hAnsi="Aptos"/>
+          <w:rFonts w:ascii="Arial" w:hAnsi="Arial"/>
           <w:b w:val="0"/>
           <w:i w:val="0"/>
           <w:color w:val="000000"/>
@@ -387,7 +387,7 @@
       </w:pPr>
       <w:r>
         <w:rPr>
-          <w:rFonts w:ascii="Aptos" w:hAnsi="Aptos"/>
+          <w:rFonts w:ascii="Arial" w:hAnsi="Arial"/>
           <w:b w:val="0"/>
           <w:i w:val="0"/>
           <w:color w:val="000000"/>
@@ -405,7 +405,7 @@
       </w:pPr>
       <w:r>
         <w:rPr>
-          <w:rFonts w:ascii="Aptos" w:hAnsi="Aptos"/>
+          <w:rFonts w:ascii="Arial" w:hAnsi="Arial"/>
           <w:b/>
           <w:i w:val="0"/>
           <w:color w:val="000000"/>
@@ -415,7 +415,7 @@
       </w:r>
       <w:r>
         <w:rPr>
-          <w:rFonts w:ascii="Aptos" w:hAnsi="Aptos"/>
+          <w:rFonts w:ascii="Arial" w:hAnsi="Arial"/>
           <w:b/>
           <w:i w:val="0"/>
           <w:color w:val="000000"/>
@@ -432,13 +432,33 @@
       </w:pPr>
       <w:r>
         <w:rPr>
-          <w:rFonts w:ascii="Aptos" w:hAnsi="Aptos"/>
+          <w:rFonts w:ascii="Arial" w:hAnsi="Arial"/>
           <w:b w:val="0"/>
           <w:i w:val="0"/>
           <w:color w:val="000000"/>
           <w:sz w:val="19"/>
         </w:rPr>
         <w:t>Redesigned key B2C and B2B marketplace flows, supporting adoption among 4K+ active users.</w:t>
+      </w:r>
+    </w:p>
+    <w:p>
+      <w:pPr>
+        <w:pStyle w:val="Heading1"/>
+      </w:pPr>
+      <w:r>
+        <w:t>Education</w:t>
+      </w:r>
+    </w:p>
+    <w:p>
+      <w:r>
+        <w:rPr>
+          <w:rFonts w:ascii="Arial" w:hAnsi="Arial"/>
+          <w:b w:val="0"/>
+          <w:i w:val="0"/>
+          <w:color w:val="000000"/>
+          <w:sz w:val="19"/>
+        </w:rPr>
+        <w:t>Baltic International Academy, Riga | Master's degree, Marketing in Leisure Industry</w:t>
       </w:r>
     </w:p>
     <w:p>
@@ -455,33 +475,13 @@
       </w:pPr>
       <w:r>
         <w:rPr>
-          <w:rFonts w:ascii="Aptos" w:hAnsi="Aptos"/>
+          <w:rFonts w:ascii="Arial" w:hAnsi="Arial"/>
           <w:b w:val="0"/>
           <w:i w:val="0"/>
           <w:color w:val="000000"/>
           <w:sz w:val="19"/>
         </w:rPr>
         <w:t>UX Design, UI Design, Interaction Design, Information Architecture, User Flows, Wireframing, Interactive Prototyping, User Research, User Interviews, Usability Testing, Responsive Design, Accessibility, Design Systems, Component Libraries, Design Tokens, Developer Handoff, Figma, FigJam, ProtoPie, Adobe Photoshop, Adobe Illustrator, ChatGPT, Claude, Codex.</w:t>
-      </w:r>
-    </w:p>
-    <w:p>
-      <w:pPr>
-        <w:pStyle w:val="Heading1"/>
-      </w:pPr>
-      <w:r>
-        <w:t>Education</w:t>
-      </w:r>
-    </w:p>
-    <w:p>
-      <w:r>
-        <w:rPr>
-          <w:rFonts w:ascii="Aptos" w:hAnsi="Aptos"/>
-          <w:b w:val="0"/>
-          <w:i w:val="0"/>
-          <w:color w:val="000000"/>
-          <w:sz w:val="19"/>
-        </w:rPr>
-        <w:t>Baltic International Academy, Riga | Master's degree, Marketing in Leisure Industry</w:t>
       </w:r>
     </w:p>
     <w:sectPr>
@@ -861,7 +861,7 @@
       <w:spacing w:after="48" w:line="250" w:lineRule="auto"/>
     </w:pPr>
     <w:rPr>
-      <w:rFonts w:ascii="Aptos" w:hAnsi="Aptos"/>
+      <w:rFonts w:ascii="Arial" w:hAnsi="Arial"/>
       <w:color w:val="000000"/>
       <w:sz w:val="19"/>
     </w:rPr>
@@ -880,6 +880,9 @@
       </w:tabs>
       <w:spacing w:after="0" w:line="240" w:lineRule="auto"/>
     </w:pPr>
+    <w:rPr>
+      <w:rFonts w:ascii="Arial" w:hAnsi="Arial"/>
+    </w:rPr>
   </w:style>
   <w:style w:type="character" w:customStyle="1" w:styleId="HeaderChar">
     <w:name w:val="Header Char"/>
@@ -887,6 +890,9 @@
     <w:link w:val="Header"/>
     <w:uiPriority w:val="99"/>
     <w:rsid w:val="00E618BF"/>
+    <w:rPr>
+      <w:rFonts w:ascii="Arial" w:hAnsi="Arial"/>
+    </w:rPr>
   </w:style>
   <w:style w:type="paragraph" w:styleId="Footer">
     <w:name w:val="footer"/>
@@ -902,6 +908,9 @@
       </w:tabs>
       <w:spacing w:after="0" w:line="240" w:lineRule="auto"/>
     </w:pPr>
+    <w:rPr>
+      <w:rFonts w:ascii="Arial" w:hAnsi="Arial"/>
+    </w:rPr>
   </w:style>
   <w:style w:type="character" w:customStyle="1" w:styleId="FooterChar">
     <w:name w:val="Footer Char"/>
@@ -909,6 +918,9 @@
     <w:link w:val="Footer"/>
     <w:uiPriority w:val="99"/>
     <w:rsid w:val="00E618BF"/>
+    <w:rPr>
+      <w:rFonts w:ascii="Arial" w:hAnsi="Arial"/>
+    </w:rPr>
   </w:style>
   <w:style w:type="paragraph" w:styleId="Heading1">
     <w:name w:val="heading 1"/>
@@ -925,7 +937,7 @@
       <w:outlineLvl w:val="0"/>
     </w:pPr>
     <w:rPr>
-      <w:rFonts w:asciiTheme="majorHAnsi" w:eastAsiaTheme="majorEastAsia" w:hAnsiTheme="majorHAnsi" w:cstheme="majorBidi" w:ascii="Aptos" w:hAnsi="Aptos"/>
+      <w:rFonts w:asciiTheme="majorHAnsi" w:eastAsiaTheme="majorEastAsia" w:hAnsiTheme="majorHAnsi" w:cstheme="majorBidi" w:ascii="Arial" w:hAnsi="Arial"/>
       <w:b/>
       <w:bCs/>
       <w:color w:val="000000"/>
@@ -949,7 +961,7 @@
       <w:outlineLvl w:val="1"/>
     </w:pPr>
     <w:rPr>
-      <w:rFonts w:asciiTheme="majorHAnsi" w:eastAsiaTheme="majorEastAsia" w:hAnsiTheme="majorHAnsi" w:cstheme="majorBidi" w:ascii="Aptos" w:hAnsi="Aptos"/>
+      <w:rFonts w:asciiTheme="majorHAnsi" w:eastAsiaTheme="majorEastAsia" w:hAnsiTheme="majorHAnsi" w:cstheme="majorBidi" w:ascii="Arial" w:hAnsi="Arial"/>
       <w:b/>
       <w:bCs/>
       <w:color w:val="000000"/>
@@ -973,7 +985,7 @@
       <w:outlineLvl w:val="2"/>
     </w:pPr>
     <w:rPr>
-      <w:rFonts w:asciiTheme="majorHAnsi" w:eastAsiaTheme="majorEastAsia" w:hAnsiTheme="majorHAnsi" w:cstheme="majorBidi"/>
+      <w:rFonts w:asciiTheme="majorHAnsi" w:eastAsiaTheme="majorEastAsia" w:hAnsiTheme="majorHAnsi" w:cstheme="majorBidi" w:ascii="Arial" w:hAnsi="Arial"/>
       <w:b/>
       <w:bCs/>
       <w:color w:val="4F81BD" w:themeColor="accent1"/>
@@ -996,7 +1008,7 @@
       <w:outlineLvl w:val="3"/>
     </w:pPr>
     <w:rPr>
-      <w:rFonts w:asciiTheme="majorHAnsi" w:eastAsiaTheme="majorEastAsia" w:hAnsiTheme="majorHAnsi" w:cstheme="majorBidi"/>
+      <w:rFonts w:asciiTheme="majorHAnsi" w:eastAsiaTheme="majorEastAsia" w:hAnsiTheme="majorHAnsi" w:cstheme="majorBidi" w:ascii="Arial" w:hAnsi="Arial"/>
       <w:b/>
       <w:bCs/>
       <w:i/>
@@ -1021,7 +1033,7 @@
       <w:outlineLvl w:val="4"/>
     </w:pPr>
     <w:rPr>
-      <w:rFonts w:asciiTheme="majorHAnsi" w:eastAsiaTheme="majorEastAsia" w:hAnsiTheme="majorHAnsi" w:cstheme="majorBidi"/>
+      <w:rFonts w:asciiTheme="majorHAnsi" w:eastAsiaTheme="majorEastAsia" w:hAnsiTheme="majorHAnsi" w:cstheme="majorBidi" w:ascii="Arial" w:hAnsi="Arial"/>
       <w:color w:val="243F60" w:themeColor="accent1" w:themeShade="7F"/>
     </w:rPr>
   </w:style>
@@ -1042,7 +1054,7 @@
       <w:outlineLvl w:val="5"/>
     </w:pPr>
     <w:rPr>
-      <w:rFonts w:asciiTheme="majorHAnsi" w:eastAsiaTheme="majorEastAsia" w:hAnsiTheme="majorHAnsi" w:cstheme="majorBidi"/>
+      <w:rFonts w:asciiTheme="majorHAnsi" w:eastAsiaTheme="majorEastAsia" w:hAnsiTheme="majorHAnsi" w:cstheme="majorBidi" w:ascii="Arial" w:hAnsi="Arial"/>
       <w:i/>
       <w:iCs/>
       <w:color w:val="243F60" w:themeColor="accent1" w:themeShade="7F"/>
@@ -1065,7 +1077,7 @@
       <w:outlineLvl w:val="6"/>
     </w:pPr>
     <w:rPr>
-      <w:rFonts w:asciiTheme="majorHAnsi" w:eastAsiaTheme="majorEastAsia" w:hAnsiTheme="majorHAnsi" w:cstheme="majorBidi"/>
+      <w:rFonts w:asciiTheme="majorHAnsi" w:eastAsiaTheme="majorEastAsia" w:hAnsiTheme="majorHAnsi" w:cstheme="majorBidi" w:ascii="Arial" w:hAnsi="Arial"/>
       <w:i/>
       <w:iCs/>
       <w:color w:val="404040" w:themeColor="text1" w:themeTint="BF"/>
@@ -1088,7 +1100,7 @@
       <w:outlineLvl w:val="7"/>
     </w:pPr>
     <w:rPr>
-      <w:rFonts w:asciiTheme="majorHAnsi" w:eastAsiaTheme="majorEastAsia" w:hAnsiTheme="majorHAnsi" w:cstheme="majorBidi"/>
+      <w:rFonts w:asciiTheme="majorHAnsi" w:eastAsiaTheme="majorEastAsia" w:hAnsiTheme="majorHAnsi" w:cstheme="majorBidi" w:ascii="Arial" w:hAnsi="Arial"/>
       <w:color w:val="4F81BD" w:themeColor="accent1"/>
       <w:sz w:val="20"/>
       <w:szCs w:val="20"/>
@@ -1111,7 +1123,7 @@
       <w:outlineLvl w:val="8"/>
     </w:pPr>
     <w:rPr>
-      <w:rFonts w:asciiTheme="majorHAnsi" w:eastAsiaTheme="majorEastAsia" w:hAnsiTheme="majorHAnsi" w:cstheme="majorBidi"/>
+      <w:rFonts w:asciiTheme="majorHAnsi" w:eastAsiaTheme="majorEastAsia" w:hAnsiTheme="majorHAnsi" w:cstheme="majorBidi" w:ascii="Arial" w:hAnsi="Arial"/>
       <w:i/>
       <w:iCs/>
       <w:color w:val="404040" w:themeColor="text1" w:themeTint="BF"/>
@@ -1124,12 +1136,18 @@
     <w:uiPriority w:val="1"/>
     <w:semiHidden/>
     <w:unhideWhenUsed/>
+    <w:rPr>
+      <w:rFonts w:ascii="Arial" w:hAnsi="Arial"/>
+    </w:rPr>
   </w:style>
   <w:style w:type="table" w:default="1" w:styleId="TableNormal">
     <w:name w:val="Normal Table"/>
     <w:uiPriority w:val="99"/>
     <w:semiHidden/>
     <w:unhideWhenUsed/>
+    <w:rPr>
+      <w:rFonts w:ascii="Arial" w:hAnsi="Arial"/>
+    </w:rPr>
     <w:tblPr>
       <w:tblInd w:w="0" w:type="dxa"/>
       <w:tblCellMar>
@@ -1154,6 +1172,9 @@
     <w:pPr>
       <w:spacing w:after="0" w:line="240" w:lineRule="auto"/>
     </w:pPr>
+    <w:rPr>
+      <w:rFonts w:ascii="Arial" w:hAnsi="Arial"/>
+    </w:rPr>
   </w:style>
   <w:style w:type="character" w:customStyle="1" w:styleId="Heading1Char">
     <w:name w:val="Heading 1 Char"/>
@@ -1162,7 +1183,7 @@
     <w:uiPriority w:val="9"/>
     <w:rsid w:val="00FC693F"/>
     <w:rPr>
-      <w:rFonts w:asciiTheme="majorHAnsi" w:eastAsiaTheme="majorEastAsia" w:hAnsiTheme="majorHAnsi" w:cstheme="majorBidi"/>
+      <w:rFonts w:asciiTheme="majorHAnsi" w:eastAsiaTheme="majorEastAsia" w:hAnsiTheme="majorHAnsi" w:cstheme="majorBidi" w:ascii="Arial" w:hAnsi="Arial"/>
       <w:b/>
       <w:bCs/>
       <w:color w:val="365F91" w:themeColor="accent1" w:themeShade="BF"/>
@@ -1177,7 +1198,7 @@
     <w:uiPriority w:val="9"/>
     <w:rsid w:val="00FC693F"/>
     <w:rPr>
-      <w:rFonts w:asciiTheme="majorHAnsi" w:eastAsiaTheme="majorEastAsia" w:hAnsiTheme="majorHAnsi" w:cstheme="majorBidi"/>
+      <w:rFonts w:asciiTheme="majorHAnsi" w:eastAsiaTheme="majorEastAsia" w:hAnsiTheme="majorHAnsi" w:cstheme="majorBidi" w:ascii="Arial" w:hAnsi="Arial"/>
       <w:b/>
       <w:bCs/>
       <w:color w:val="4F81BD" w:themeColor="accent1"/>
@@ -1192,7 +1213,7 @@
     <w:uiPriority w:val="9"/>
     <w:rsid w:val="00FC693F"/>
     <w:rPr>
-      <w:rFonts w:asciiTheme="majorHAnsi" w:eastAsiaTheme="majorEastAsia" w:hAnsiTheme="majorHAnsi" w:cstheme="majorBidi"/>
+      <w:rFonts w:asciiTheme="majorHAnsi" w:eastAsiaTheme="majorEastAsia" w:hAnsiTheme="majorHAnsi" w:cstheme="majorBidi" w:ascii="Arial" w:hAnsi="Arial"/>
       <w:b/>
       <w:bCs/>
       <w:color w:val="4F81BD" w:themeColor="accent1"/>
@@ -1211,7 +1232,7 @@
       <w:contextualSpacing/>
     </w:pPr>
     <w:rPr>
-      <w:rFonts w:asciiTheme="majorHAnsi" w:eastAsiaTheme="majorEastAsia" w:hAnsiTheme="majorHAnsi" w:cstheme="majorBidi" w:ascii="Aptos" w:hAnsi="Aptos"/>
+      <w:rFonts w:asciiTheme="majorHAnsi" w:eastAsiaTheme="majorEastAsia" w:hAnsiTheme="majorHAnsi" w:cstheme="majorBidi" w:ascii="Arial" w:hAnsi="Arial"/>
       <w:b/>
       <w:color w:val="000000"/>
       <w:spacing w:val="5"/>
@@ -1227,7 +1248,7 @@
     <w:uiPriority w:val="10"/>
     <w:rsid w:val="00FC693F"/>
     <w:rPr>
-      <w:rFonts w:asciiTheme="majorHAnsi" w:eastAsiaTheme="majorEastAsia" w:hAnsiTheme="majorHAnsi" w:cstheme="majorBidi"/>
+      <w:rFonts w:asciiTheme="majorHAnsi" w:eastAsiaTheme="majorEastAsia" w:hAnsiTheme="majorHAnsi" w:cstheme="majorBidi" w:ascii="Arial" w:hAnsi="Arial"/>
       <w:color w:val="17365D" w:themeColor="text2" w:themeShade="BF"/>
       <w:spacing w:val="5"/>
       <w:kern w:val="28"/>
@@ -1249,7 +1270,7 @@
       </w:numPr>
     </w:pPr>
     <w:rPr>
-      <w:rFonts w:asciiTheme="majorHAnsi" w:eastAsiaTheme="majorEastAsia" w:hAnsiTheme="majorHAnsi" w:cstheme="majorBidi"/>
+      <w:rFonts w:asciiTheme="majorHAnsi" w:eastAsiaTheme="majorEastAsia" w:hAnsiTheme="majorHAnsi" w:cstheme="majorBidi" w:ascii="Arial" w:hAnsi="Arial"/>
       <w:i/>
       <w:iCs/>
       <w:color w:val="4F81BD" w:themeColor="accent1"/>
@@ -1265,7 +1286,7 @@
     <w:uiPriority w:val="11"/>
     <w:rsid w:val="00FC693F"/>
     <w:rPr>
-      <w:rFonts w:asciiTheme="majorHAnsi" w:eastAsiaTheme="majorEastAsia" w:hAnsiTheme="majorHAnsi" w:cstheme="majorBidi"/>
+      <w:rFonts w:asciiTheme="majorHAnsi" w:eastAsiaTheme="majorEastAsia" w:hAnsiTheme="majorHAnsi" w:cstheme="majorBidi" w:ascii="Arial" w:hAnsi="Arial"/>
       <w:i/>
       <w:iCs/>
       <w:color w:val="4F81BD" w:themeColor="accent1"/>
@@ -1284,6 +1305,9 @@
       <w:ind w:left="720"/>
       <w:contextualSpacing/>
     </w:pPr>
+    <w:rPr>
+      <w:rFonts w:ascii="Arial" w:hAnsi="Arial"/>
+    </w:rPr>
   </w:style>
   <w:style w:type="paragraph" w:styleId="BodyText">
     <w:name w:val="Body Text"/>
@@ -1295,6 +1319,9 @@
     <w:pPr>
       <w:spacing w:after="120"/>
     </w:pPr>
+    <w:rPr>
+      <w:rFonts w:ascii="Arial" w:hAnsi="Arial"/>
+    </w:rPr>
   </w:style>
   <w:style w:type="character" w:customStyle="1" w:styleId="BodyTextChar">
     <w:name w:val="Body Text Char"/>
@@ -1302,6 +1329,9 @@
     <w:link w:val="BodyText"/>
     <w:uiPriority w:val="99"/>
     <w:rsid w:val="00AA1D8D"/>
+    <w:rPr>
+      <w:rFonts w:ascii="Arial" w:hAnsi="Arial"/>
+    </w:rPr>
   </w:style>
   <w:style w:type="paragraph" w:styleId="BodyText2">
     <w:name w:val="Body Text 2"/>
@@ -1313,6 +1343,9 @@
     <w:pPr>
       <w:spacing w:after="120" w:line="480" w:lineRule="auto"/>
     </w:pPr>
+    <w:rPr>
+      <w:rFonts w:ascii="Arial" w:hAnsi="Arial"/>
+    </w:rPr>
   </w:style>
   <w:style w:type="character" w:customStyle="1" w:styleId="BodyText2Char">
     <w:name w:val="Body Text 2 Char"/>
@@ -1320,6 +1353,9 @@
     <w:link w:val="BodyText2"/>
     <w:uiPriority w:val="99"/>
     <w:rsid w:val="00AA1D8D"/>
+    <w:rPr>
+      <w:rFonts w:ascii="Arial" w:hAnsi="Arial"/>
+    </w:rPr>
   </w:style>
   <w:style w:type="paragraph" w:styleId="BodyText3">
     <w:name w:val="Body Text 3"/>
@@ -1332,6 +1368,7 @@
       <w:spacing w:after="120"/>
     </w:pPr>
     <w:rPr>
+      <w:rFonts w:ascii="Arial" w:hAnsi="Arial"/>
       <w:sz w:val="16"/>
       <w:szCs w:val="16"/>
     </w:rPr>
@@ -1343,6 +1380,7 @@
     <w:uiPriority w:val="99"/>
     <w:rsid w:val="00AA1D8D"/>
     <w:rPr>
+      <w:rFonts w:ascii="Arial" w:hAnsi="Arial"/>
       <w:sz w:val="16"/>
       <w:szCs w:val="16"/>
     </w:rPr>
@@ -1357,6 +1395,9 @@
       <w:ind w:left="360" w:hanging="360"/>
       <w:contextualSpacing/>
     </w:pPr>
+    <w:rPr>
+      <w:rFonts w:ascii="Arial" w:hAnsi="Arial"/>
+    </w:rPr>
   </w:style>
   <w:style w:type="paragraph" w:styleId="List2">
     <w:name w:val="List 2"/>
@@ -1368,6 +1409,9 @@
       <w:ind w:left="720" w:hanging="360"/>
       <w:contextualSpacing/>
     </w:pPr>
+    <w:rPr>
+      <w:rFonts w:ascii="Arial" w:hAnsi="Arial"/>
+    </w:rPr>
   </w:style>
   <w:style w:type="paragraph" w:styleId="List3">
     <w:name w:val="List 3"/>
@@ -1379,6 +1423,9 @@
       <w:ind w:left="1080" w:hanging="360"/>
       <w:contextualSpacing/>
     </w:pPr>
+    <w:rPr>
+      <w:rFonts w:ascii="Arial" w:hAnsi="Arial"/>
+    </w:rPr>
   </w:style>
   <w:style w:type="paragraph" w:styleId="ListBullet">
     <w:name w:val="List Bullet"/>
@@ -1395,7 +1442,7 @@
       <w:contextualSpacing/>
     </w:pPr>
     <w:rPr>
-      <w:rFonts w:ascii="Aptos" w:hAnsi="Aptos"/>
+      <w:rFonts w:ascii="Arial" w:hAnsi="Arial"/>
       <w:color w:val="000000"/>
       <w:sz w:val="19"/>
     </w:rPr>
@@ -1412,6 +1459,9 @@
       </w:numPr>
       <w:contextualSpacing/>
     </w:pPr>
+    <w:rPr>
+      <w:rFonts w:ascii="Arial" w:hAnsi="Arial"/>
+    </w:rPr>
   </w:style>
   <w:style w:type="paragraph" w:styleId="ListBullet3">
     <w:name w:val="List Bullet 3"/>
@@ -1425,6 +1475,9 @@
       </w:numPr>
       <w:contextualSpacing/>
     </w:pPr>
+    <w:rPr>
+      <w:rFonts w:ascii="Arial" w:hAnsi="Arial"/>
+    </w:rPr>
   </w:style>
   <w:style w:type="paragraph" w:styleId="ListNumber">
     <w:name w:val="List Number"/>
@@ -1438,6 +1491,9 @@
       </w:numPr>
       <w:contextualSpacing/>
     </w:pPr>
+    <w:rPr>
+      <w:rFonts w:ascii="Arial" w:hAnsi="Arial"/>
+    </w:rPr>
   </w:style>
   <w:style w:type="paragraph" w:styleId="ListNumber2">
     <w:name w:val="List Number 2"/>
@@ -1451,6 +1507,9 @@
       </w:numPr>
       <w:contextualSpacing/>
     </w:pPr>
+    <w:rPr>
+      <w:rFonts w:ascii="Arial" w:hAnsi="Arial"/>
+    </w:rPr>
   </w:style>
   <w:style w:type="paragraph" w:styleId="ListNumber3">
     <w:name w:val="List Number 3"/>
@@ -1464,6 +1523,9 @@
       </w:numPr>
       <w:contextualSpacing/>
     </w:pPr>
+    <w:rPr>
+      <w:rFonts w:ascii="Arial" w:hAnsi="Arial"/>
+    </w:rPr>
   </w:style>
   <w:style w:type="paragraph" w:styleId="ListContinue">
     <w:name w:val="List Continue"/>
@@ -1476,6 +1538,9 @@
       <w:ind w:left="360"/>
       <w:contextualSpacing/>
     </w:pPr>
+    <w:rPr>
+      <w:rFonts w:ascii="Arial" w:hAnsi="Arial"/>
+    </w:rPr>
   </w:style>
   <w:style w:type="paragraph" w:styleId="ListContinue2">
     <w:name w:val="List Continue 2"/>
@@ -1488,6 +1553,9 @@
       <w:ind w:left="720"/>
       <w:contextualSpacing/>
     </w:pPr>
+    <w:rPr>
+      <w:rFonts w:ascii="Arial" w:hAnsi="Arial"/>
+    </w:rPr>
   </w:style>
   <w:style w:type="paragraph" w:styleId="ListContinue3">
     <w:name w:val="List Continue 3"/>
@@ -1500,6 +1568,9 @@
       <w:ind w:left="1080"/>
       <w:contextualSpacing/>
     </w:pPr>
+    <w:rPr>
+      <w:rFonts w:ascii="Arial" w:hAnsi="Arial"/>
+    </w:rPr>
   </w:style>
   <w:style w:type="paragraph" w:styleId="MacroText">
     <w:name w:val="macro"/>
@@ -1519,7 +1590,7 @@
       </w:tabs>
     </w:pPr>
     <w:rPr>
-      <w:rFonts w:ascii="Courier" w:hAnsi="Courier"/>
+      <w:rFonts w:ascii="Arial" w:hAnsi="Arial"/>
       <w:sz w:val="20"/>
       <w:szCs w:val="20"/>
     </w:rPr>
@@ -1531,7 +1602,7 @@
     <w:uiPriority w:val="99"/>
     <w:rsid w:val="0029639D"/>
     <w:rPr>
-      <w:rFonts w:ascii="Courier" w:hAnsi="Courier"/>
+      <w:rFonts w:ascii="Arial" w:hAnsi="Arial"/>
       <w:sz w:val="20"/>
       <w:szCs w:val="20"/>
     </w:rPr>
@@ -1545,6 +1616,7 @@
     <w:qFormat/>
     <w:rsid w:val="00FC693F"/>
     <w:rPr>
+      <w:rFonts w:ascii="Arial" w:hAnsi="Arial"/>
       <w:i/>
       <w:iCs/>
       <w:color w:val="000000" w:themeColor="text1"/>
@@ -1557,6 +1629,7 @@
     <w:uiPriority w:val="29"/>
     <w:rsid w:val="00FC693F"/>
     <w:rPr>
+      <w:rFonts w:ascii="Arial" w:hAnsi="Arial"/>
       <w:i/>
       <w:iCs/>
       <w:color w:val="000000" w:themeColor="text1"/>
@@ -1570,7 +1643,7 @@
     <w:semiHidden/>
     <w:rsid w:val="00FC693F"/>
     <w:rPr>
-      <w:rFonts w:asciiTheme="majorHAnsi" w:eastAsiaTheme="majorEastAsia" w:hAnsiTheme="majorHAnsi" w:cstheme="majorBidi"/>
+      <w:rFonts w:asciiTheme="majorHAnsi" w:eastAsiaTheme="majorEastAsia" w:hAnsiTheme="majorHAnsi" w:cstheme="majorBidi" w:ascii="Arial" w:hAnsi="Arial"/>
       <w:b/>
       <w:bCs/>
       <w:i/>
@@ -1586,7 +1659,7 @@
     <w:semiHidden/>
     <w:rsid w:val="00FC693F"/>
     <w:rPr>
-      <w:rFonts w:asciiTheme="majorHAnsi" w:eastAsiaTheme="majorEastAsia" w:hAnsiTheme="majorHAnsi" w:cstheme="majorBidi"/>
+      <w:rFonts w:asciiTheme="majorHAnsi" w:eastAsiaTheme="majorEastAsia" w:hAnsiTheme="majorHAnsi" w:cstheme="majorBidi" w:ascii="Arial" w:hAnsi="Arial"/>
       <w:color w:val="243F60" w:themeColor="accent1" w:themeShade="7F"/>
     </w:rPr>
   </w:style>
@@ -1598,7 +1671,7 @@
     <w:semiHidden/>
     <w:rsid w:val="00FC693F"/>
     <w:rPr>
-      <w:rFonts w:asciiTheme="majorHAnsi" w:eastAsiaTheme="majorEastAsia" w:hAnsiTheme="majorHAnsi" w:cstheme="majorBidi"/>
+      <w:rFonts w:asciiTheme="majorHAnsi" w:eastAsiaTheme="majorEastAsia" w:hAnsiTheme="majorHAnsi" w:cstheme="majorBidi" w:ascii="Arial" w:hAnsi="Arial"/>
       <w:i/>
       <w:iCs/>
       <w:color w:val="243F60" w:themeColor="accent1" w:themeShade="7F"/>
@@ -1612,7 +1685,7 @@
     <w:semiHidden/>
     <w:rsid w:val="00FC693F"/>
     <w:rPr>
-      <w:rFonts w:asciiTheme="majorHAnsi" w:eastAsiaTheme="majorEastAsia" w:hAnsiTheme="majorHAnsi" w:cstheme="majorBidi"/>
+      <w:rFonts w:asciiTheme="majorHAnsi" w:eastAsiaTheme="majorEastAsia" w:hAnsiTheme="majorHAnsi" w:cstheme="majorBidi" w:ascii="Arial" w:hAnsi="Arial"/>
       <w:i/>
       <w:iCs/>
       <w:color w:val="404040" w:themeColor="text1" w:themeTint="BF"/>
@@ -1626,7 +1699,7 @@
     <w:semiHidden/>
     <w:rsid w:val="00FC693F"/>
     <w:rPr>
-      <w:rFonts w:asciiTheme="majorHAnsi" w:eastAsiaTheme="majorEastAsia" w:hAnsiTheme="majorHAnsi" w:cstheme="majorBidi"/>
+      <w:rFonts w:asciiTheme="majorHAnsi" w:eastAsiaTheme="majorEastAsia" w:hAnsiTheme="majorHAnsi" w:cstheme="majorBidi" w:ascii="Arial" w:hAnsi="Arial"/>
       <w:color w:val="4F81BD" w:themeColor="accent1"/>
       <w:sz w:val="20"/>
       <w:szCs w:val="20"/>
@@ -1640,7 +1713,7 @@
     <w:semiHidden/>
     <w:rsid w:val="00FC693F"/>
     <w:rPr>
-      <w:rFonts w:asciiTheme="majorHAnsi" w:eastAsiaTheme="majorEastAsia" w:hAnsiTheme="majorHAnsi" w:cstheme="majorBidi"/>
+      <w:rFonts w:asciiTheme="majorHAnsi" w:eastAsiaTheme="majorEastAsia" w:hAnsiTheme="majorHAnsi" w:cstheme="majorBidi" w:ascii="Arial" w:hAnsi="Arial"/>
       <w:i/>
       <w:iCs/>
       <w:color w:val="404040" w:themeColor="text1" w:themeTint="BF"/>
@@ -1661,6 +1734,7 @@
       <w:spacing w:line="240" w:lineRule="auto"/>
     </w:pPr>
     <w:rPr>
+      <w:rFonts w:ascii="Arial" w:hAnsi="Arial"/>
       <w:b/>
       <w:bCs/>
       <w:color w:val="4F81BD" w:themeColor="accent1"/>
@@ -1675,6 +1749,7 @@
     <w:qFormat/>
     <w:rsid w:val="00FC693F"/>
     <w:rPr>
+      <w:rFonts w:ascii="Arial" w:hAnsi="Arial"/>
       <w:b/>
       <w:bCs/>
     </w:rPr>
@@ -1686,6 +1761,7 @@
     <w:qFormat/>
     <w:rsid w:val="00FC693F"/>
     <w:rPr>
+      <w:rFonts w:ascii="Arial" w:hAnsi="Arial"/>
       <w:i/>
       <w:iCs/>
     </w:rPr>
@@ -1706,6 +1782,7 @@
       <w:ind w:left="936" w:right="936"/>
     </w:pPr>
     <w:rPr>
+      <w:rFonts w:ascii="Arial" w:hAnsi="Arial"/>
       <w:b/>
       <w:bCs/>
       <w:i/>
@@ -1720,6 +1797,7 @@
     <w:uiPriority w:val="30"/>
     <w:rsid w:val="00FC693F"/>
     <w:rPr>
+      <w:rFonts w:ascii="Arial" w:hAnsi="Arial"/>
       <w:b/>
       <w:bCs/>
       <w:i/>
@@ -1734,6 +1812,7 @@
     <w:qFormat/>
     <w:rsid w:val="00FC693F"/>
     <w:rPr>
+      <w:rFonts w:ascii="Arial" w:hAnsi="Arial"/>
       <w:i/>
       <w:iCs/>
       <w:color w:val="808080" w:themeColor="text1" w:themeTint="7F"/>
@@ -1746,6 +1825,7 @@
     <w:qFormat/>
     <w:rsid w:val="00FC693F"/>
     <w:rPr>
+      <w:rFonts w:ascii="Arial" w:hAnsi="Arial"/>
       <w:b/>
       <w:bCs/>
       <w:i/>
@@ -1760,6 +1840,7 @@
     <w:qFormat/>
     <w:rsid w:val="00FC693F"/>
     <w:rPr>
+      <w:rFonts w:ascii="Arial" w:hAnsi="Arial"/>
       <w:smallCaps/>
       <w:color w:val="C0504D" w:themeColor="accent2"/>
       <w:u w:val="single"/>
@@ -1772,6 +1853,7 @@
     <w:qFormat/>
     <w:rsid w:val="00FC693F"/>
     <w:rPr>
+      <w:rFonts w:ascii="Arial" w:hAnsi="Arial"/>
       <w:b/>
       <w:bCs/>
       <w:smallCaps/>
@@ -1787,6 +1869,7 @@
     <w:qFormat/>
     <w:rsid w:val="00FC693F"/>
     <w:rPr>
+      <w:rFonts w:ascii="Arial" w:hAnsi="Arial"/>
       <w:b/>
       <w:bCs/>
       <w:smallCaps/>
@@ -1805,6 +1888,9 @@
     <w:pPr>
       <w:outlineLvl w:val="9"/>
     </w:pPr>
+    <w:rPr>
+      <w:rFonts w:ascii="Arial" w:hAnsi="Arial"/>
+    </w:rPr>
   </w:style>
   <w:style w:type="table" w:styleId="TableGrid">
     <w:name w:val="Table Grid"/>
@@ -1814,6 +1900,9 @@
     <w:pPr>
       <w:spacing w:after="0" w:line="240" w:lineRule="auto"/>
     </w:pPr>
+    <w:rPr>
+      <w:rFonts w:ascii="Arial" w:hAnsi="Arial"/>
+    </w:rPr>
     <w:tblPr>
       <w:tblInd w:w="0" w:type="dxa"/>
       <w:tblBorders>
@@ -1841,6 +1930,7 @@
       <w:spacing w:after="0" w:line="240" w:lineRule="auto"/>
     </w:pPr>
     <w:rPr>
+      <w:rFonts w:ascii="Arial" w:hAnsi="Arial"/>
       <w:color w:val="000000" w:themeColor="text1" w:themeShade="BF"/>
     </w:rPr>
     <w:tblPr>
@@ -1944,6 +2034,7 @@
       <w:spacing w:after="0" w:line="240" w:lineRule="auto"/>
     </w:pPr>
     <w:rPr>
+      <w:rFonts w:ascii="Arial" w:hAnsi="Arial"/>
       <w:color w:val="365F91" w:themeColor="accent1" w:themeShade="BF"/>
     </w:rPr>
     <w:tblPr>
@@ -2047,6 +2138,7 @@
       <w:spacing w:after="0" w:line="240" w:lineRule="auto"/>
     </w:pPr>
     <w:rPr>
+      <w:rFonts w:ascii="Arial" w:hAnsi="Arial"/>
       <w:color w:val="943634" w:themeColor="accent2" w:themeShade="BF"/>
     </w:rPr>
     <w:tblPr>
@@ -2150,6 +2242,7 @@
       <w:spacing w:after="0" w:line="240" w:lineRule="auto"/>
     </w:pPr>
     <w:rPr>
+      <w:rFonts w:ascii="Arial" w:hAnsi="Arial"/>
       <w:color w:val="76923C" w:themeColor="accent3" w:themeShade="BF"/>
     </w:rPr>
     <w:tblPr>
@@ -2253,6 +2346,7 @@
       <w:spacing w:after="0" w:line="240" w:lineRule="auto"/>
     </w:pPr>
     <w:rPr>
+      <w:rFonts w:ascii="Arial" w:hAnsi="Arial"/>
       <w:color w:val="5F497A" w:themeColor="accent4" w:themeShade="BF"/>
     </w:rPr>
     <w:tblPr>
@@ -2356,6 +2450,7 @@
       <w:spacing w:after="0" w:line="240" w:lineRule="auto"/>
     </w:pPr>
     <w:rPr>
+      <w:rFonts w:ascii="Arial" w:hAnsi="Arial"/>
       <w:color w:val="31849B" w:themeColor="accent5" w:themeShade="BF"/>
     </w:rPr>
     <w:tblPr>
@@ -2459,6 +2554,7 @@
       <w:spacing w:after="0" w:line="240" w:lineRule="auto"/>
     </w:pPr>
     <w:rPr>
+      <w:rFonts w:ascii="Arial" w:hAnsi="Arial"/>
       <w:color w:val="E36C0A" w:themeColor="accent6" w:themeShade="BF"/>
     </w:rPr>
     <w:tblPr>
@@ -2561,6 +2657,9 @@
     <w:pPr>
       <w:spacing w:after="0" w:line="240" w:lineRule="auto"/>
     </w:pPr>
+    <w:rPr>
+      <w:rFonts w:ascii="Arial" w:hAnsi="Arial"/>
+    </w:rPr>
     <w:tblPr>
       <w:tblStyleRowBandSize w:val="1"/>
       <w:tblStyleColBandSize w:val="1"/>
@@ -2653,6 +2752,9 @@
     <w:pPr>
       <w:spacing w:after="0" w:line="240" w:lineRule="auto"/>
     </w:pPr>
+    <w:rPr>
+      <w:rFonts w:ascii="Arial" w:hAnsi="Arial"/>
+    </w:rPr>
     <w:tblPr>
       <w:tblStyleRowBandSize w:val="1"/>
       <w:tblStyleColBandSize w:val="1"/>
@@ -2745,6 +2847,9 @@
     <w:pPr>
       <w:spacing w:after="0" w:line="240" w:lineRule="auto"/>
     </w:pPr>
+    <w:rPr>
+      <w:rFonts w:ascii="Arial" w:hAnsi="Arial"/>
+    </w:rPr>
     <w:tblPr>
       <w:tblStyleRowBandSize w:val="1"/>
       <w:tblStyleColBandSize w:val="1"/>
@@ -2837,6 +2942,9 @@
     <w:pPr>
       <w:spacing w:after="0" w:line="240" w:lineRule="auto"/>
     </w:pPr>
+    <w:rPr>
+      <w:rFonts w:ascii="Arial" w:hAnsi="Arial"/>
+    </w:rPr>
     <w:tblPr>
       <w:tblStyleRowBandSize w:val="1"/>
       <w:tblStyleColBandSize w:val="1"/>
@@ -2929,6 +3037,9 @@
     <w:pPr>
       <w:spacing w:after="0" w:line="240" w:lineRule="auto"/>
     </w:pPr>
+    <w:rPr>
+      <w:rFonts w:ascii="Arial" w:hAnsi="Arial"/>
+    </w:rPr>
     <w:tblPr>
       <w:tblStyleRowBandSize w:val="1"/>
       <w:tblStyleColBandSize w:val="1"/>
@@ -3021,6 +3132,9 @@
     <w:pPr>
       <w:spacing w:after="0" w:line="240" w:lineRule="auto"/>
     </w:pPr>
+    <w:rPr>
+      <w:rFonts w:ascii="Arial" w:hAnsi="Arial"/>
+    </w:rPr>
     <w:tblPr>
       <w:tblStyleRowBandSize w:val="1"/>
       <w:tblStyleColBandSize w:val="1"/>
@@ -3113,6 +3227,9 @@
     <w:pPr>
       <w:spacing w:after="0" w:line="240" w:lineRule="auto"/>
     </w:pPr>
+    <w:rPr>
+      <w:rFonts w:ascii="Arial" w:hAnsi="Arial"/>
+    </w:rPr>
     <w:tblPr>
       <w:tblStyleRowBandSize w:val="1"/>
       <w:tblStyleColBandSize w:val="1"/>
@@ -3205,6 +3322,9 @@
     <w:pPr>
       <w:spacing w:after="0" w:line="240" w:lineRule="auto"/>
     </w:pPr>
+    <w:rPr>
+      <w:rFonts w:ascii="Arial" w:hAnsi="Arial"/>
+    </w:rPr>
     <w:tblPr>
       <w:tblStyleRowBandSize w:val="1"/>
       <w:tblStyleColBandSize w:val="1"/>
@@ -3335,6 +3455,9 @@
     <w:pPr>
       <w:spacing w:after="0" w:line="240" w:lineRule="auto"/>
     </w:pPr>
+    <w:rPr>
+      <w:rFonts w:ascii="Arial" w:hAnsi="Arial"/>
+    </w:rPr>
     <w:tblPr>
       <w:tblStyleRowBandSize w:val="1"/>
       <w:tblStyleColBandSize w:val="1"/>
@@ -3465,6 +3588,9 @@
     <w:pPr>
       <w:spacing w:after="0" w:line="240" w:lineRule="auto"/>
     </w:pPr>
+    <w:rPr>
+      <w:rFonts w:ascii="Arial" w:hAnsi="Arial"/>
+    </w:rPr>
     <w:tblPr>
       <w:tblStyleRowBandSize w:val="1"/>
       <w:tblStyleColBandSize w:val="1"/>
@@ -3595,6 +3721,9 @@
     <w:pPr>
       <w:spacing w:after="0" w:line="240" w:lineRule="auto"/>
     </w:pPr>
+    <w:rPr>
+      <w:rFonts w:ascii="Arial" w:hAnsi="Arial"/>
+    </w:rPr>
     <w:tblPr>
       <w:tblStyleRowBandSize w:val="1"/>
       <w:tblStyleColBandSize w:val="1"/>
@@ -3725,6 +3854,9 @@
     <w:pPr>
       <w:spacing w:after="0" w:line="240" w:lineRule="auto"/>
     </w:pPr>
+    <w:rPr>
+      <w:rFonts w:ascii="Arial" w:hAnsi="Arial"/>
+    </w:rPr>
     <w:tblPr>
       <w:tblStyleRowBandSize w:val="1"/>
       <w:tblStyleColBandSize w:val="1"/>
@@ -3855,6 +3987,9 @@
     <w:pPr>
       <w:spacing w:after="0" w:line="240" w:lineRule="auto"/>
     </w:pPr>
+    <w:rPr>
+      <w:rFonts w:ascii="Arial" w:hAnsi="Arial"/>
+    </w:rPr>
     <w:tblPr>
       <w:tblStyleRowBandSize w:val="1"/>
       <w:tblStyleColBandSize w:val="1"/>
@@ -3985,6 +4120,9 @@
     <w:pPr>
       <w:spacing w:after="0" w:line="240" w:lineRule="auto"/>
     </w:pPr>
+    <w:rPr>
+      <w:rFonts w:ascii="Arial" w:hAnsi="Arial"/>
+    </w:rPr>
     <w:tblPr>
       <w:tblStyleRowBandSize w:val="1"/>
       <w:tblStyleColBandSize w:val="1"/>
@@ -4115,6 +4253,9 @@
     <w:pPr>
       <w:spacing w:after="0" w:line="240" w:lineRule="auto"/>
     </w:pPr>
+    <w:rPr>
+      <w:rFonts w:ascii="Arial" w:hAnsi="Arial"/>
+    </w:rPr>
     <w:tblPr>
       <w:tblStyleRowBandSize w:val="1"/>
       <w:tblStyleColBandSize w:val="1"/>
@@ -4221,6 +4362,9 @@
     <w:pPr>
       <w:spacing w:after="0" w:line="240" w:lineRule="auto"/>
     </w:pPr>
+    <w:rPr>
+      <w:rFonts w:ascii="Arial" w:hAnsi="Arial"/>
+    </w:rPr>
     <w:tblPr>
       <w:tblStyleRowBandSize w:val="1"/>
       <w:tblStyleColBandSize w:val="1"/>
@@ -4327,6 +4471,9 @@
     <w:pPr>
       <w:spacing w:after="0" w:line="240" w:lineRule="auto"/>
     </w:pPr>
+    <w:rPr>
+      <w:rFonts w:ascii="Arial" w:hAnsi="Arial"/>
+    </w:rPr>
     <w:tblPr>
       <w:tblStyleRowBandSize w:val="1"/>
       <w:tblStyleColBandSize w:val="1"/>
@@ -4433,6 +4580,9 @@
     <w:pPr>
       <w:spacing w:after="0" w:line="240" w:lineRule="auto"/>
     </w:pPr>
+    <w:rPr>
+      <w:rFonts w:ascii="Arial" w:hAnsi="Arial"/>
+    </w:rPr>
     <w:tblPr>
       <w:tblStyleRowBandSize w:val="1"/>
       <w:tblStyleColBandSize w:val="1"/>
@@ -4539,6 +4689,9 @@
     <w:pPr>
       <w:spacing w:after="0" w:line="240" w:lineRule="auto"/>
     </w:pPr>
+    <w:rPr>
+      <w:rFonts w:ascii="Arial" w:hAnsi="Arial"/>
+    </w:rPr>
     <w:tblPr>
       <w:tblStyleRowBandSize w:val="1"/>
       <w:tblStyleColBandSize w:val="1"/>
@@ -4645,6 +4798,9 @@
     <w:pPr>
       <w:spacing w:after="0" w:line="240" w:lineRule="auto"/>
     </w:pPr>
+    <w:rPr>
+      <w:rFonts w:ascii="Arial" w:hAnsi="Arial"/>
+    </w:rPr>
     <w:tblPr>
       <w:tblStyleRowBandSize w:val="1"/>
       <w:tblStyleColBandSize w:val="1"/>
@@ -4751,6 +4907,9 @@
     <w:pPr>
       <w:spacing w:after="0" w:line="240" w:lineRule="auto"/>
     </w:pPr>
+    <w:rPr>
+      <w:rFonts w:ascii="Arial" w:hAnsi="Arial"/>
+    </w:rPr>
     <w:tblPr>
       <w:tblStyleRowBandSize w:val="1"/>
       <w:tblStyleColBandSize w:val="1"/>
@@ -4857,6 +5016,9 @@
     <w:pPr>
       <w:spacing w:after="0" w:line="240" w:lineRule="auto"/>
     </w:pPr>
+    <w:rPr>
+      <w:rFonts w:ascii="Arial" w:hAnsi="Arial"/>
+    </w:rPr>
     <w:tblPr>
       <w:tblStyleRowBandSize w:val="1"/>
       <w:tblStyleColBandSize w:val="1"/>
@@ -5006,6 +5168,9 @@
     <w:pPr>
       <w:spacing w:after="0" w:line="240" w:lineRule="auto"/>
     </w:pPr>
+    <w:rPr>
+      <w:rFonts w:ascii="Arial" w:hAnsi="Arial"/>
+    </w:rPr>
     <w:tblPr>
       <w:tblStyleRowBandSize w:val="1"/>
       <w:tblStyleColBandSize w:val="1"/>
@@ -5155,6 +5320,9 @@
     <w:pPr>
       <w:spacing w:after="0" w:line="240" w:lineRule="auto"/>
     </w:pPr>
+    <w:rPr>
+      <w:rFonts w:ascii="Arial" w:hAnsi="Arial"/>
+    </w:rPr>
     <w:tblPr>
       <w:tblStyleRowBandSize w:val="1"/>
       <w:tblStyleColBandSize w:val="1"/>
@@ -5304,6 +5472,9 @@
     <w:pPr>
       <w:spacing w:after="0" w:line="240" w:lineRule="auto"/>
     </w:pPr>
+    <w:rPr>
+      <w:rFonts w:ascii="Arial" w:hAnsi="Arial"/>
+    </w:rPr>
     <w:tblPr>
       <w:tblStyleRowBandSize w:val="1"/>
       <w:tblStyleColBandSize w:val="1"/>
@@ -5453,6 +5624,9 @@
     <w:pPr>
       <w:spacing w:after="0" w:line="240" w:lineRule="auto"/>
     </w:pPr>
+    <w:rPr>
+      <w:rFonts w:ascii="Arial" w:hAnsi="Arial"/>
+    </w:rPr>
     <w:tblPr>
       <w:tblStyleRowBandSize w:val="1"/>
       <w:tblStyleColBandSize w:val="1"/>
@@ -5602,6 +5776,9 @@
     <w:pPr>
       <w:spacing w:after="0" w:line="240" w:lineRule="auto"/>
     </w:pPr>
+    <w:rPr>
+      <w:rFonts w:ascii="Arial" w:hAnsi="Arial"/>
+    </w:rPr>
     <w:tblPr>
       <w:tblStyleRowBandSize w:val="1"/>
       <w:tblStyleColBandSize w:val="1"/>
@@ -5751,6 +5928,9 @@
     <w:pPr>
       <w:spacing w:after="0" w:line="240" w:lineRule="auto"/>
     </w:pPr>
+    <w:rPr>
+      <w:rFonts w:ascii="Arial" w:hAnsi="Arial"/>
+    </w:rPr>
     <w:tblPr>
       <w:tblStyleRowBandSize w:val="1"/>
       <w:tblStyleColBandSize w:val="1"/>
@@ -5901,6 +6081,7 @@
       <w:spacing w:after="0" w:line="240" w:lineRule="auto"/>
     </w:pPr>
     <w:rPr>
+      <w:rFonts w:ascii="Arial" w:hAnsi="Arial"/>
       <w:color w:val="000000" w:themeColor="text1"/>
     </w:rPr>
     <w:tblPr>
@@ -5985,6 +6166,7 @@
       <w:spacing w:after="0" w:line="240" w:lineRule="auto"/>
     </w:pPr>
     <w:rPr>
+      <w:rFonts w:ascii="Arial" w:hAnsi="Arial"/>
       <w:color w:val="000000" w:themeColor="text1"/>
     </w:rPr>
     <w:tblPr>
@@ -6069,6 +6251,7 @@
       <w:spacing w:after="0" w:line="240" w:lineRule="auto"/>
     </w:pPr>
     <w:rPr>
+      <w:rFonts w:ascii="Arial" w:hAnsi="Arial"/>
       <w:color w:val="000000" w:themeColor="text1"/>
     </w:rPr>
     <w:tblPr>
@@ -6153,6 +6336,7 @@
       <w:spacing w:after="0" w:line="240" w:lineRule="auto"/>
     </w:pPr>
     <w:rPr>
+      <w:rFonts w:ascii="Arial" w:hAnsi="Arial"/>
       <w:color w:val="000000" w:themeColor="text1"/>
     </w:rPr>
     <w:tblPr>
@@ -6237,6 +6421,7 @@
       <w:spacing w:after="0" w:line="240" w:lineRule="auto"/>
     </w:pPr>
     <w:rPr>
+      <w:rFonts w:ascii="Arial" w:hAnsi="Arial"/>
       <w:color w:val="000000" w:themeColor="text1"/>
     </w:rPr>
     <w:tblPr>
@@ -6321,6 +6506,7 @@
       <w:spacing w:after="0" w:line="240" w:lineRule="auto"/>
     </w:pPr>
     <w:rPr>
+      <w:rFonts w:ascii="Arial" w:hAnsi="Arial"/>
       <w:color w:val="000000" w:themeColor="text1"/>
     </w:rPr>
     <w:tblPr>
@@ -6405,6 +6591,7 @@
       <w:spacing w:after="0" w:line="240" w:lineRule="auto"/>
     </w:pPr>
     <w:rPr>
+      <w:rFonts w:ascii="Arial" w:hAnsi="Arial"/>
       <w:color w:val="000000" w:themeColor="text1"/>
     </w:rPr>
     <w:tblPr>
@@ -6489,7 +6676,7 @@
       <w:spacing w:after="0" w:line="240" w:lineRule="auto"/>
     </w:pPr>
     <w:rPr>
-      <w:rFonts w:asciiTheme="majorHAnsi" w:eastAsiaTheme="majorEastAsia" w:hAnsiTheme="majorHAnsi" w:cstheme="majorBidi"/>
+      <w:rFonts w:asciiTheme="majorHAnsi" w:eastAsiaTheme="majorEastAsia" w:hAnsiTheme="majorHAnsi" w:cstheme="majorBidi" w:ascii="Arial" w:hAnsi="Arial"/>
       <w:color w:val="000000" w:themeColor="text1"/>
     </w:rPr>
     <w:tblPr>
@@ -6617,7 +6804,7 @@
       <w:spacing w:after="0" w:line="240" w:lineRule="auto"/>
     </w:pPr>
     <w:rPr>
-      <w:rFonts w:asciiTheme="majorHAnsi" w:eastAsiaTheme="majorEastAsia" w:hAnsiTheme="majorHAnsi" w:cstheme="majorBidi"/>
+      <w:rFonts w:asciiTheme="majorHAnsi" w:eastAsiaTheme="majorEastAsia" w:hAnsiTheme="majorHAnsi" w:cstheme="majorBidi" w:ascii="Arial" w:hAnsi="Arial"/>
       <w:color w:val="000000" w:themeColor="text1"/>
     </w:rPr>
     <w:tblPr>
@@ -6745,7 +6932,7 @@
       <w:spacing w:after="0" w:line="240" w:lineRule="auto"/>
     </w:pPr>
     <w:rPr>
-      <w:rFonts w:asciiTheme="majorHAnsi" w:eastAsiaTheme="majorEastAsia" w:hAnsiTheme="majorHAnsi" w:cstheme="majorBidi"/>
+      <w:rFonts w:asciiTheme="majorHAnsi" w:eastAsiaTheme="majorEastAsia" w:hAnsiTheme="majorHAnsi" w:cstheme="majorBidi" w:ascii="Arial" w:hAnsi="Arial"/>
       <w:color w:val="000000" w:themeColor="text1"/>
     </w:rPr>
     <w:tblPr>
@@ -6873,7 +7060,7 @@
       <w:spacing w:after="0" w:line="240" w:lineRule="auto"/>
     </w:pPr>
     <w:rPr>
-      <w:rFonts w:asciiTheme="majorHAnsi" w:eastAsiaTheme="majorEastAsia" w:hAnsiTheme="majorHAnsi" w:cstheme="majorBidi"/>
+      <w:rFonts w:asciiTheme="majorHAnsi" w:eastAsiaTheme="majorEastAsia" w:hAnsiTheme="majorHAnsi" w:cstheme="majorBidi" w:ascii="Arial" w:hAnsi="Arial"/>
       <w:color w:val="000000" w:themeColor="text1"/>
     </w:rPr>
     <w:tblPr>
@@ -7001,7 +7188,7 @@
       <w:spacing w:after="0" w:line="240" w:lineRule="auto"/>
     </w:pPr>
     <w:rPr>
-      <w:rFonts w:asciiTheme="majorHAnsi" w:eastAsiaTheme="majorEastAsia" w:hAnsiTheme="majorHAnsi" w:cstheme="majorBidi"/>
+      <w:rFonts w:asciiTheme="majorHAnsi" w:eastAsiaTheme="majorEastAsia" w:hAnsiTheme="majorHAnsi" w:cstheme="majorBidi" w:ascii="Arial" w:hAnsi="Arial"/>
       <w:color w:val="000000" w:themeColor="text1"/>
     </w:rPr>
     <w:tblPr>
@@ -7129,7 +7316,7 @@
       <w:spacing w:after="0" w:line="240" w:lineRule="auto"/>
     </w:pPr>
     <w:rPr>
-      <w:rFonts w:asciiTheme="majorHAnsi" w:eastAsiaTheme="majorEastAsia" w:hAnsiTheme="majorHAnsi" w:cstheme="majorBidi"/>
+      <w:rFonts w:asciiTheme="majorHAnsi" w:eastAsiaTheme="majorEastAsia" w:hAnsiTheme="majorHAnsi" w:cstheme="majorBidi" w:ascii="Arial" w:hAnsi="Arial"/>
       <w:color w:val="000000" w:themeColor="text1"/>
     </w:rPr>
     <w:tblPr>
@@ -7257,7 +7444,7 @@
       <w:spacing w:after="0" w:line="240" w:lineRule="auto"/>
     </w:pPr>
     <w:rPr>
-      <w:rFonts w:asciiTheme="majorHAnsi" w:eastAsiaTheme="majorEastAsia" w:hAnsiTheme="majorHAnsi" w:cstheme="majorBidi"/>
+      <w:rFonts w:asciiTheme="majorHAnsi" w:eastAsiaTheme="majorEastAsia" w:hAnsiTheme="majorHAnsi" w:cstheme="majorBidi" w:ascii="Arial" w:hAnsi="Arial"/>
       <w:color w:val="000000" w:themeColor="text1"/>
     </w:rPr>
     <w:tblPr>
@@ -7384,6 +7571,9 @@
     <w:pPr>
       <w:spacing w:after="0" w:line="240" w:lineRule="auto"/>
     </w:pPr>
+    <w:rPr>
+      <w:rFonts w:ascii="Arial" w:hAnsi="Arial"/>
+    </w:rPr>
     <w:tblPr>
       <w:tblStyleRowBandSize w:val="1"/>
       <w:tblStyleColBandSize w:val="1"/>
@@ -7457,6 +7647,9 @@
     <w:pPr>
       <w:spacing w:after="0" w:line="240" w:lineRule="auto"/>
     </w:pPr>
+    <w:rPr>
+      <w:rFonts w:ascii="Arial" w:hAnsi="Arial"/>
+    </w:rPr>
     <w:tblPr>
       <w:tblStyleRowBandSize w:val="1"/>
       <w:tblStyleColBandSize w:val="1"/>
@@ -7530,6 +7723,9 @@
     <w:pPr>
       <w:spacing w:after="0" w:line="240" w:lineRule="auto"/>
     </w:pPr>
+    <w:rPr>
+      <w:rFonts w:ascii="Arial" w:hAnsi="Arial"/>
+    </w:rPr>
     <w:tblPr>
       <w:tblStyleRowBandSize w:val="1"/>
       <w:tblStyleColBandSize w:val="1"/>
@@ -7603,6 +7799,9 @@
     <w:pPr>
       <w:spacing w:after="0" w:line="240" w:lineRule="auto"/>
     </w:pPr>
+    <w:rPr>
+      <w:rFonts w:ascii="Arial" w:hAnsi="Arial"/>
+    </w:rPr>
     <w:tblPr>
       <w:tblStyleRowBandSize w:val="1"/>
       <w:tblStyleColBandSize w:val="1"/>
@@ -7676,6 +7875,9 @@
     <w:pPr>
       <w:spacing w:after="0" w:line="240" w:lineRule="auto"/>
     </w:pPr>
+    <w:rPr>
+      <w:rFonts w:ascii="Arial" w:hAnsi="Arial"/>
+    </w:rPr>
     <w:tblPr>
       <w:tblStyleRowBandSize w:val="1"/>
       <w:tblStyleColBandSize w:val="1"/>
@@ -7749,6 +7951,9 @@
     <w:pPr>
       <w:spacing w:after="0" w:line="240" w:lineRule="auto"/>
     </w:pPr>
+    <w:rPr>
+      <w:rFonts w:ascii="Arial" w:hAnsi="Arial"/>
+    </w:rPr>
     <w:tblPr>
       <w:tblStyleRowBandSize w:val="1"/>
       <w:tblStyleColBandSize w:val="1"/>
@@ -7822,6 +8027,9 @@
     <w:pPr>
       <w:spacing w:after="0" w:line="240" w:lineRule="auto"/>
     </w:pPr>
+    <w:rPr>
+      <w:rFonts w:ascii="Arial" w:hAnsi="Arial"/>
+    </w:rPr>
     <w:tblPr>
       <w:tblStyleRowBandSize w:val="1"/>
       <w:tblStyleColBandSize w:val="1"/>
@@ -7896,7 +8104,7 @@
       <w:spacing w:after="0" w:line="240" w:lineRule="auto"/>
     </w:pPr>
     <w:rPr>
-      <w:rFonts w:asciiTheme="majorHAnsi" w:eastAsiaTheme="majorEastAsia" w:hAnsiTheme="majorHAnsi" w:cstheme="majorBidi"/>
+      <w:rFonts w:asciiTheme="majorHAnsi" w:eastAsiaTheme="majorEastAsia" w:hAnsiTheme="majorHAnsi" w:cstheme="majorBidi" w:ascii="Arial" w:hAnsi="Arial"/>
       <w:color w:val="000000" w:themeColor="text1"/>
     </w:rPr>
     <w:tblPr>
@@ -8021,7 +8229,7 @@
       <w:spacing w:after="0" w:line="240" w:lineRule="auto"/>
     </w:pPr>
     <w:rPr>
-      <w:rFonts w:asciiTheme="majorHAnsi" w:eastAsiaTheme="majorEastAsia" w:hAnsiTheme="majorHAnsi" w:cstheme="majorBidi"/>
+      <w:rFonts w:asciiTheme="majorHAnsi" w:eastAsiaTheme="majorEastAsia" w:hAnsiTheme="majorHAnsi" w:cstheme="majorBidi" w:ascii="Arial" w:hAnsi="Arial"/>
       <w:color w:val="000000" w:themeColor="text1"/>
     </w:rPr>
     <w:tblPr>
@@ -8146,7 +8354,7 @@
       <w:spacing w:after="0" w:line="240" w:lineRule="auto"/>
     </w:pPr>
     <w:rPr>
-      <w:rFonts w:asciiTheme="majorHAnsi" w:eastAsiaTheme="majorEastAsia" w:hAnsiTheme="majorHAnsi" w:cstheme="majorBidi"/>
+      <w:rFonts w:asciiTheme="majorHAnsi" w:eastAsiaTheme="majorEastAsia" w:hAnsiTheme="majorHAnsi" w:cstheme="majorBidi" w:ascii="Arial" w:hAnsi="Arial"/>
       <w:color w:val="000000" w:themeColor="text1"/>
     </w:rPr>
     <w:tblPr>
@@ -8271,7 +8479,7 @@
       <w:spacing w:after="0" w:line="240" w:lineRule="auto"/>
     </w:pPr>
     <w:rPr>
-      <w:rFonts w:asciiTheme="majorHAnsi" w:eastAsiaTheme="majorEastAsia" w:hAnsiTheme="majorHAnsi" w:cstheme="majorBidi"/>
+      <w:rFonts w:asciiTheme="majorHAnsi" w:eastAsiaTheme="majorEastAsia" w:hAnsiTheme="majorHAnsi" w:cstheme="majorBidi" w:ascii="Arial" w:hAnsi="Arial"/>
       <w:color w:val="000000" w:themeColor="text1"/>
     </w:rPr>
     <w:tblPr>
@@ -8396,7 +8604,7 @@
       <w:spacing w:after="0" w:line="240" w:lineRule="auto"/>
     </w:pPr>
     <w:rPr>
-      <w:rFonts w:asciiTheme="majorHAnsi" w:eastAsiaTheme="majorEastAsia" w:hAnsiTheme="majorHAnsi" w:cstheme="majorBidi"/>
+      <w:rFonts w:asciiTheme="majorHAnsi" w:eastAsiaTheme="majorEastAsia" w:hAnsiTheme="majorHAnsi" w:cstheme="majorBidi" w:ascii="Arial" w:hAnsi="Arial"/>
       <w:color w:val="000000" w:themeColor="text1"/>
     </w:rPr>
     <w:tblPr>
@@ -8521,7 +8729,7 @@
       <w:spacing w:after="0" w:line="240" w:lineRule="auto"/>
     </w:pPr>
     <w:rPr>
-      <w:rFonts w:asciiTheme="majorHAnsi" w:eastAsiaTheme="majorEastAsia" w:hAnsiTheme="majorHAnsi" w:cstheme="majorBidi"/>
+      <w:rFonts w:asciiTheme="majorHAnsi" w:eastAsiaTheme="majorEastAsia" w:hAnsiTheme="majorHAnsi" w:cstheme="majorBidi" w:ascii="Arial" w:hAnsi="Arial"/>
       <w:color w:val="000000" w:themeColor="text1"/>
     </w:rPr>
     <w:tblPr>
@@ -8646,7 +8854,7 @@
       <w:spacing w:after="0" w:line="240" w:lineRule="auto"/>
     </w:pPr>
     <w:rPr>
-      <w:rFonts w:asciiTheme="majorHAnsi" w:eastAsiaTheme="majorEastAsia" w:hAnsiTheme="majorHAnsi" w:cstheme="majorBidi"/>
+      <w:rFonts w:asciiTheme="majorHAnsi" w:eastAsiaTheme="majorEastAsia" w:hAnsiTheme="majorHAnsi" w:cstheme="majorBidi" w:ascii="Arial" w:hAnsi="Arial"/>
       <w:color w:val="000000" w:themeColor="text1"/>
     </w:rPr>
     <w:tblPr>
@@ -8770,6 +8978,9 @@
     <w:pPr>
       <w:spacing w:after="0" w:line="240" w:lineRule="auto"/>
     </w:pPr>
+    <w:rPr>
+      <w:rFonts w:ascii="Arial" w:hAnsi="Arial"/>
+    </w:rPr>
     <w:tblPr>
       <w:tblStyleRowBandSize w:val="1"/>
       <w:tblStyleColBandSize w:val="1"/>
@@ -8911,6 +9122,9 @@
     <w:pPr>
       <w:spacing w:after="0" w:line="240" w:lineRule="auto"/>
     </w:pPr>
+    <w:rPr>
+      <w:rFonts w:ascii="Arial" w:hAnsi="Arial"/>
+    </w:rPr>
     <w:tblPr>
       <w:tblStyleRowBandSize w:val="1"/>
       <w:tblStyleColBandSize w:val="1"/>
@@ -9052,6 +9266,9 @@
     <w:pPr>
       <w:spacing w:after="0" w:line="240" w:lineRule="auto"/>
     </w:pPr>
+    <w:rPr>
+      <w:rFonts w:ascii="Arial" w:hAnsi="Arial"/>
+    </w:rPr>
     <w:tblPr>
       <w:tblStyleRowBandSize w:val="1"/>
       <w:tblStyleColBandSize w:val="1"/>
@@ -9193,6 +9410,9 @@
     <w:pPr>
       <w:spacing w:after="0" w:line="240" w:lineRule="auto"/>
     </w:pPr>
+    <w:rPr>
+      <w:rFonts w:ascii="Arial" w:hAnsi="Arial"/>
+    </w:rPr>
     <w:tblPr>
       <w:tblStyleRowBandSize w:val="1"/>
       <w:tblStyleColBandSize w:val="1"/>
@@ -9334,6 +9554,9 @@
     <w:pPr>
       <w:spacing w:after="0" w:line="240" w:lineRule="auto"/>
     </w:pPr>
+    <w:rPr>
+      <w:rFonts w:ascii="Arial" w:hAnsi="Arial"/>
+    </w:rPr>
     <w:tblPr>
       <w:tblStyleRowBandSize w:val="1"/>
       <w:tblStyleColBandSize w:val="1"/>
@@ -9475,6 +9698,9 @@
     <w:pPr>
       <w:spacing w:after="0" w:line="240" w:lineRule="auto"/>
     </w:pPr>
+    <w:rPr>
+      <w:rFonts w:ascii="Arial" w:hAnsi="Arial"/>
+    </w:rPr>
     <w:tblPr>
       <w:tblStyleRowBandSize w:val="1"/>
       <w:tblStyleColBandSize w:val="1"/>
@@ -9616,6 +9842,9 @@
     <w:pPr>
       <w:spacing w:after="0" w:line="240" w:lineRule="auto"/>
     </w:pPr>
+    <w:rPr>
+      <w:rFonts w:ascii="Arial" w:hAnsi="Arial"/>
+    </w:rPr>
     <w:tblPr>
       <w:tblStyleRowBandSize w:val="1"/>
       <w:tblStyleColBandSize w:val="1"/>
@@ -9758,6 +9987,7 @@
       <w:spacing w:after="0" w:line="240" w:lineRule="auto"/>
     </w:pPr>
     <w:rPr>
+      <w:rFonts w:ascii="Arial" w:hAnsi="Arial"/>
       <w:color w:val="FFFFFF" w:themeColor="background1"/>
     </w:rPr>
     <w:tblPr>
@@ -9872,6 +10102,7 @@
       <w:spacing w:after="0" w:line="240" w:lineRule="auto"/>
     </w:pPr>
     <w:rPr>
+      <w:rFonts w:ascii="Arial" w:hAnsi="Arial"/>
       <w:color w:val="FFFFFF" w:themeColor="background1"/>
     </w:rPr>
     <w:tblPr>
@@ -9986,6 +10217,7 @@
       <w:spacing w:after="0" w:line="240" w:lineRule="auto"/>
     </w:pPr>
     <w:rPr>
+      <w:rFonts w:ascii="Arial" w:hAnsi="Arial"/>
       <w:color w:val="FFFFFF" w:themeColor="background1"/>
     </w:rPr>
     <w:tblPr>
@@ -10100,6 +10332,7 @@
       <w:spacing w:after="0" w:line="240" w:lineRule="auto"/>
     </w:pPr>
     <w:rPr>
+      <w:rFonts w:ascii="Arial" w:hAnsi="Arial"/>
       <w:color w:val="FFFFFF" w:themeColor="background1"/>
     </w:rPr>
     <w:tblPr>
@@ -10214,6 +10447,7 @@
       <w:spacing w:after="0" w:line="240" w:lineRule="auto"/>
     </w:pPr>
     <w:rPr>
+      <w:rFonts w:ascii="Arial" w:hAnsi="Arial"/>
       <w:color w:val="FFFFFF" w:themeColor="background1"/>
     </w:rPr>
     <w:tblPr>
@@ -10328,6 +10562,7 @@
       <w:spacing w:after="0" w:line="240" w:lineRule="auto"/>
     </w:pPr>
     <w:rPr>
+      <w:rFonts w:ascii="Arial" w:hAnsi="Arial"/>
       <w:color w:val="FFFFFF" w:themeColor="background1"/>
     </w:rPr>
     <w:tblPr>
@@ -10442,6 +10677,7 @@
       <w:spacing w:after="0" w:line="240" w:lineRule="auto"/>
     </w:pPr>
     <w:rPr>
+      <w:rFonts w:ascii="Arial" w:hAnsi="Arial"/>
       <w:color w:val="FFFFFF" w:themeColor="background1"/>
     </w:rPr>
     <w:tblPr>
@@ -10556,6 +10792,7 @@
       <w:spacing w:after="0" w:line="240" w:lineRule="auto"/>
     </w:pPr>
     <w:rPr>
+      <w:rFonts w:ascii="Arial" w:hAnsi="Arial"/>
       <w:color w:val="000000" w:themeColor="text1"/>
     </w:rPr>
     <w:tblPr>
@@ -10678,6 +10915,7 @@
       <w:spacing w:after="0" w:line="240" w:lineRule="auto"/>
     </w:pPr>
     <w:rPr>
+      <w:rFonts w:ascii="Arial" w:hAnsi="Arial"/>
       <w:color w:val="000000" w:themeColor="text1"/>
     </w:rPr>
     <w:tblPr>
@@ -10800,6 +11038,7 @@
       <w:spacing w:after="0" w:line="240" w:lineRule="auto"/>
     </w:pPr>
     <w:rPr>
+      <w:rFonts w:ascii="Arial" w:hAnsi="Arial"/>
       <w:color w:val="000000" w:themeColor="text1"/>
     </w:rPr>
     <w:tblPr>
@@ -10922,6 +11161,7 @@
       <w:spacing w:after="0" w:line="240" w:lineRule="auto"/>
     </w:pPr>
     <w:rPr>
+      <w:rFonts w:ascii="Arial" w:hAnsi="Arial"/>
       <w:color w:val="000000" w:themeColor="text1"/>
     </w:rPr>
     <w:tblPr>
@@ -11034,6 +11274,7 @@
       <w:spacing w:after="0" w:line="240" w:lineRule="auto"/>
     </w:pPr>
     <w:rPr>
+      <w:rFonts w:ascii="Arial" w:hAnsi="Arial"/>
       <w:color w:val="000000" w:themeColor="text1"/>
     </w:rPr>
     <w:tblPr>
@@ -11156,6 +11397,7 @@
       <w:spacing w:after="0" w:line="240" w:lineRule="auto"/>
     </w:pPr>
     <w:rPr>
+      <w:rFonts w:ascii="Arial" w:hAnsi="Arial"/>
       <w:color w:val="000000" w:themeColor="text1"/>
     </w:rPr>
     <w:tblPr>
@@ -11278,6 +11520,7 @@
       <w:spacing w:after="0" w:line="240" w:lineRule="auto"/>
     </w:pPr>
     <w:rPr>
+      <w:rFonts w:ascii="Arial" w:hAnsi="Arial"/>
       <w:color w:val="000000" w:themeColor="text1"/>
     </w:rPr>
     <w:tblPr>
@@ -11400,6 +11643,7 @@
       <w:spacing w:after="0" w:line="240" w:lineRule="auto"/>
     </w:pPr>
     <w:rPr>
+      <w:rFonts w:ascii="Arial" w:hAnsi="Arial"/>
       <w:color w:val="000000" w:themeColor="text1"/>
     </w:rPr>
     <w:tblPr>
@@ -11486,6 +11730,7 @@
       <w:spacing w:after="0" w:line="240" w:lineRule="auto"/>
     </w:pPr>
     <w:rPr>
+      <w:rFonts w:ascii="Arial" w:hAnsi="Arial"/>
       <w:color w:val="000000" w:themeColor="text1"/>
     </w:rPr>
     <w:tblPr>
@@ -11572,6 +11817,7 @@
       <w:spacing w:after="0" w:line="240" w:lineRule="auto"/>
     </w:pPr>
     <w:rPr>
+      <w:rFonts w:ascii="Arial" w:hAnsi="Arial"/>
       <w:color w:val="000000" w:themeColor="text1"/>
     </w:rPr>
     <w:tblPr>
@@ -11658,6 +11904,7 @@
       <w:spacing w:after="0" w:line="240" w:lineRule="auto"/>
     </w:pPr>
     <w:rPr>
+      <w:rFonts w:ascii="Arial" w:hAnsi="Arial"/>
       <w:color w:val="000000" w:themeColor="text1"/>
     </w:rPr>
     <w:tblPr>
@@ -11744,6 +11991,7 @@
       <w:spacing w:after="0" w:line="240" w:lineRule="auto"/>
     </w:pPr>
     <w:rPr>
+      <w:rFonts w:ascii="Arial" w:hAnsi="Arial"/>
       <w:color w:val="000000" w:themeColor="text1"/>
     </w:rPr>
     <w:tblPr>
@@ -11830,6 +12078,7 @@
       <w:spacing w:after="0" w:line="240" w:lineRule="auto"/>
     </w:pPr>
     <w:rPr>
+      <w:rFonts w:ascii="Arial" w:hAnsi="Arial"/>
       <w:color w:val="000000" w:themeColor="text1"/>
     </w:rPr>
     <w:tblPr>
@@ -11916,6 +12165,7 @@
       <w:spacing w:after="0" w:line="240" w:lineRule="auto"/>
     </w:pPr>
     <w:rPr>
+      <w:rFonts w:ascii="Arial" w:hAnsi="Arial"/>
       <w:color w:val="000000" w:themeColor="text1"/>
     </w:rPr>
     <w:tblPr>
@@ -12002,6 +12252,7 @@
       <w:spacing w:after="0" w:line="240" w:lineRule="auto"/>
     </w:pPr>
     <w:rPr>
+      <w:rFonts w:ascii="Arial" w:hAnsi="Arial"/>
       <w:color w:val="000000" w:themeColor="text1"/>
     </w:rPr>
     <w:tblPr>
@@ -12082,6 +12333,7 @@
       <w:spacing w:after="0" w:line="240" w:lineRule="auto"/>
     </w:pPr>
     <w:rPr>
+      <w:rFonts w:ascii="Arial" w:hAnsi="Arial"/>
       <w:color w:val="000000" w:themeColor="text1"/>
     </w:rPr>
     <w:tblPr>
@@ -12162,6 +12414,7 @@
       <w:spacing w:after="0" w:line="240" w:lineRule="auto"/>
     </w:pPr>
     <w:rPr>
+      <w:rFonts w:ascii="Arial" w:hAnsi="Arial"/>
       <w:color w:val="000000" w:themeColor="text1"/>
     </w:rPr>
     <w:tblPr>
@@ -12242,6 +12495,7 @@
       <w:spacing w:after="0" w:line="240" w:lineRule="auto"/>
     </w:pPr>
     <w:rPr>
+      <w:rFonts w:ascii="Arial" w:hAnsi="Arial"/>
       <w:color w:val="000000" w:themeColor="text1"/>
     </w:rPr>
     <w:tblPr>
@@ -12322,6 +12576,7 @@
       <w:spacing w:after="0" w:line="240" w:lineRule="auto"/>
     </w:pPr>
     <w:rPr>
+      <w:rFonts w:ascii="Arial" w:hAnsi="Arial"/>
       <w:color w:val="000000" w:themeColor="text1"/>
     </w:rPr>
     <w:tblPr>
@@ -12402,6 +12657,7 @@
       <w:spacing w:after="0" w:line="240" w:lineRule="auto"/>
     </w:pPr>
     <w:rPr>
+      <w:rFonts w:ascii="Arial" w:hAnsi="Arial"/>
       <w:color w:val="000000" w:themeColor="text1"/>
     </w:rPr>
     <w:tblPr>
@@ -12482,6 +12738,7 @@
       <w:spacing w:after="0" w:line="240" w:lineRule="auto"/>
     </w:pPr>
     <w:rPr>
+      <w:rFonts w:ascii="Arial" w:hAnsi="Arial"/>
       <w:color w:val="000000" w:themeColor="text1"/>
     </w:rPr>
     <w:tblPr>
@@ -12560,7 +12817,7 @@
       <w:spacing w:before="100" w:after="20"/>
     </w:pPr>
     <w:rPr>
-      <w:rFonts w:ascii="Aptos" w:hAnsi="Aptos"/>
+      <w:rFonts w:ascii="Arial" w:hAnsi="Arial"/>
       <w:b/>
       <w:color w:val="000000"/>
       <w:sz w:val="20"/>

</xml_diff>

<commit_message>
Improve UX UI CV readability
</commit_message>
<xml_diff>
--- a/output/docx/Ekaterina_Melnikova_UXUI_Designer.docx
+++ b/output/docx/Ekaterina_Melnikova_UXUI_Designer.docx
@@ -20,7 +20,7 @@
           <w:b/>
           <w:i w:val="0"/>
           <w:color w:val="000000"/>
-          <w:sz w:val="24"/>
+          <w:sz w:val="26"/>
         </w:rPr>
         <w:t>UX/UI Designer</w:t>
       </w:r>
@@ -35,7 +35,7 @@
           <w:b w:val="0"/>
           <w:i w:val="0"/>
           <w:color w:val="484848"/>
-          <w:sz w:val="19"/>
+          <w:sz w:val="20"/>
         </w:rPr>
         <w:t xml:space="preserve">Novi Sad, Serbia | Residence permit with the right to work | </w:t>
       </w:r>
@@ -45,7 +45,7 @@
             <w:color w:val="0F6F68"/>
             <w:u w:val="single"/>
             <w:rFonts w:ascii="Arial" w:hAnsi="Arial"/>
-            <w:sz w:val="19"/>
+            <w:sz w:val="20"/>
           </w:rPr>
           <w:t>domofeel@gmail.com</w:t>
         </w:r>
@@ -56,7 +56,7 @@
           <w:b w:val="0"/>
           <w:i w:val="0"/>
           <w:color w:val="484848"/>
-          <w:sz w:val="19"/>
+          <w:sz w:val="20"/>
         </w:rPr>
         <w:t xml:space="preserve"> | </w:t>
       </w:r>
@@ -66,7 +66,7 @@
             <w:color w:val="0F6F68"/>
             <w:u w:val="single"/>
             <w:rFonts w:ascii="Arial" w:hAnsi="Arial"/>
-            <w:sz w:val="19"/>
+            <w:sz w:val="20"/>
           </w:rPr>
           <w:t>LinkedIn</w:t>
         </w:r>
@@ -77,7 +77,7 @@
           <w:b w:val="0"/>
           <w:i w:val="0"/>
           <w:color w:val="484848"/>
-          <w:sz w:val="19"/>
+          <w:sz w:val="20"/>
         </w:rPr>
         <w:t xml:space="preserve"> | </w:t>
       </w:r>
@@ -87,7 +87,7 @@
             <w:color w:val="0F6F68"/>
             <w:u w:val="single"/>
             <w:rFonts w:ascii="Arial" w:hAnsi="Arial"/>
-            <w:sz w:val="19"/>
+            <w:sz w:val="20"/>
           </w:rPr>
           <w:t>Portfolio</w:t>
         </w:r>
@@ -114,7 +114,7 @@
           <w:b/>
           <w:i w:val="0"/>
           <w:color w:val="000000"/>
-          <w:sz w:val="20"/>
+          <w:sz w:val="21"/>
         </w:rPr>
         <w:t>UX/UI Designer | Zhelezno</w:t>
       </w:r>
@@ -124,7 +124,7 @@
           <w:b/>
           <w:i w:val="0"/>
           <w:color w:val="000000"/>
-          <w:sz w:val="19"/>
+          <w:sz w:val="20"/>
         </w:rPr>
         <w:tab/>
         <w:t>Jan 2022 - Now</w:t>
@@ -141,7 +141,7 @@
           <w:b w:val="0"/>
           <w:i w:val="0"/>
           <w:color w:val="000000"/>
-          <w:sz w:val="19"/>
+          <w:sz w:val="20"/>
         </w:rPr>
         <w:t>Designed complex B2B dashboards and internal tools, turning dense workflows into clear, scalable interfaces.</w:t>
       </w:r>
@@ -157,7 +157,7 @@
           <w:b w:val="0"/>
           <w:i w:val="0"/>
           <w:color w:val="000000"/>
-          <w:sz w:val="19"/>
+          <w:sz w:val="20"/>
         </w:rPr>
         <w:t>Built and maintained web and mobile design-system components, UX patterns and developer documentation, increasing development speed by 50%.</w:t>
       </w:r>
@@ -173,7 +173,7 @@
           <w:b w:val="0"/>
           <w:i w:val="0"/>
           <w:color w:val="000000"/>
-          <w:sz w:val="19"/>
+          <w:sz w:val="20"/>
         </w:rPr>
         <w:t>Worked with Product and Engineering from interaction concepts and prototypes through handoff and QA, reducing feature rework by 23%.</w:t>
       </w:r>
@@ -189,7 +189,7 @@
           <w:b w:val="0"/>
           <w:i w:val="0"/>
           <w:color w:val="000000"/>
-          <w:sz w:val="19"/>
+          <w:sz w:val="20"/>
         </w:rPr>
         <w:t>Mentored a junior designer and improved feature delivery time by 14%.</w:t>
       </w:r>
@@ -205,7 +205,7 @@
           <w:b w:val="0"/>
           <w:i w:val="0"/>
           <w:color w:val="000000"/>
-          <w:sz w:val="19"/>
+          <w:sz w:val="20"/>
         </w:rPr>
         <w:t>Redesigned B2B admin dashboards and navigation, increasing daily user adoption by 40%.</w:t>
       </w:r>
@@ -221,7 +221,7 @@
           <w:b w:val="0"/>
           <w:i w:val="0"/>
           <w:color w:val="000000"/>
-          <w:sz w:val="19"/>
+          <w:sz w:val="20"/>
         </w:rPr>
         <w:t>Used interviews, surveys and usability testing to refine flows and UI, increasing B2B retention by 42% within 13 months.</w:t>
       </w:r>
@@ -237,7 +237,7 @@
           <w:b w:val="0"/>
           <w:i w:val="0"/>
           <w:color w:val="000000"/>
-          <w:sz w:val="19"/>
+          <w:sz w:val="20"/>
         </w:rPr>
         <w:t>Designed an employee mobile app used daily by 65% of staff, accelerating task completion by 27%.</w:t>
       </w:r>
@@ -255,7 +255,7 @@
           <w:b/>
           <w:i w:val="0"/>
           <w:color w:val="000000"/>
-          <w:sz w:val="20"/>
+          <w:sz w:val="21"/>
         </w:rPr>
         <w:t>UX/UI Designer | ServiceHub</w:t>
       </w:r>
@@ -265,7 +265,7 @@
           <w:b/>
           <w:i w:val="0"/>
           <w:color w:val="000000"/>
-          <w:sz w:val="19"/>
+          <w:sz w:val="20"/>
         </w:rPr>
         <w:tab/>
         <w:t>Aug 2021 - Dec 2021</w:t>
@@ -282,7 +282,7 @@
           <w:b w:val="0"/>
           <w:i w:val="0"/>
           <w:color w:val="000000"/>
-          <w:sz w:val="19"/>
+          <w:sz w:val="20"/>
         </w:rPr>
         <w:t>Improved a fintech SaaS platform through usability testing and iterative interface design, increasing employee workflow efficiency by 9%.</w:t>
       </w:r>
@@ -298,7 +298,7 @@
           <w:b w:val="0"/>
           <w:i w:val="0"/>
           <w:color w:val="000000"/>
-          <w:sz w:val="19"/>
+          <w:sz w:val="20"/>
         </w:rPr>
         <w:t>Designed a fast-loan banking app from user flows to polished UI, leading to 30 loan completions within two weeks of launch.</w:t>
       </w:r>
@@ -314,7 +314,7 @@
           <w:b w:val="0"/>
           <w:i w:val="0"/>
           <w:color w:val="000000"/>
-          <w:sz w:val="19"/>
+          <w:sz w:val="20"/>
         </w:rPr>
         <w:t>Created branding and a landing page for an IT industry festival, generating 37+ qualified leads.</w:t>
       </w:r>
@@ -332,7 +332,7 @@
           <w:b/>
           <w:i w:val="0"/>
           <w:color w:val="000000"/>
-          <w:sz w:val="20"/>
+          <w:sz w:val="21"/>
         </w:rPr>
         <w:t>UX/UI Designer | Apple Concierge</w:t>
       </w:r>
@@ -342,7 +342,7 @@
           <w:b/>
           <w:i w:val="0"/>
           <w:color w:val="000000"/>
-          <w:sz w:val="19"/>
+          <w:sz w:val="20"/>
         </w:rPr>
         <w:tab/>
         <w:t>Oct 2020 - Dec 2021</w:t>
@@ -359,7 +359,7 @@
           <w:b w:val="0"/>
           <w:i w:val="0"/>
           <w:color w:val="000000"/>
-          <w:sz w:val="19"/>
+          <w:sz w:val="20"/>
         </w:rPr>
         <w:t>Designed B2B delivery and food-service mobile apps adopted by Gazprombank, Sberbank and Alfa-Bank, increasing service value by 23%.</w:t>
       </w:r>
@@ -375,7 +375,7 @@
           <w:b w:val="0"/>
           <w:i w:val="0"/>
           <w:color w:val="000000"/>
-          <w:sz w:val="19"/>
+          <w:sz w:val="20"/>
         </w:rPr>
         <w:t>Redesigned KPI dashboards and metric-tracking flows, reducing manager workflow time by 12%.</w:t>
       </w:r>
@@ -391,7 +391,7 @@
           <w:b w:val="0"/>
           <w:i w:val="0"/>
           <w:color w:val="000000"/>
-          <w:sz w:val="19"/>
+          <w:sz w:val="20"/>
         </w:rPr>
         <w:t>Took work from experiments and wireframes to polished UI and interactive prototypes, improving mobile app user flows by 19%.</w:t>
       </w:r>
@@ -409,7 +409,7 @@
           <w:b/>
           <w:i w:val="0"/>
           <w:color w:val="000000"/>
-          <w:sz w:val="20"/>
+          <w:sz w:val="21"/>
         </w:rPr>
         <w:t>Web Designer | CTC Media</w:t>
       </w:r>
@@ -419,7 +419,7 @@
           <w:b/>
           <w:i w:val="0"/>
           <w:color w:val="000000"/>
-          <w:sz w:val="19"/>
+          <w:sz w:val="20"/>
         </w:rPr>
         <w:tab/>
         <w:t>May 2020 - Sep 2020</w:t>
@@ -436,7 +436,7 @@
           <w:b w:val="0"/>
           <w:i w:val="0"/>
           <w:color w:val="000000"/>
-          <w:sz w:val="19"/>
+          <w:sz w:val="20"/>
         </w:rPr>
         <w:t>Redesigned key B2C and B2B marketplace flows, supporting adoption among 4K+ active users.</w:t>
       </w:r>
@@ -456,7 +456,7 @@
           <w:b w:val="0"/>
           <w:i w:val="0"/>
           <w:color w:val="000000"/>
-          <w:sz w:val="19"/>
+          <w:sz w:val="20"/>
         </w:rPr>
         <w:t>Baltic International Academy, Riga | Master's degree, Marketing in Leisure Industry</w:t>
       </w:r>
@@ -479,7 +479,7 @@
           <w:b w:val="0"/>
           <w:i w:val="0"/>
           <w:color w:val="000000"/>
-          <w:sz w:val="19"/>
+          <w:sz w:val="20"/>
         </w:rPr>
         <w:t>UX Design, UI Design, Interaction Design, Information Architecture, User Flows, Wireframing, Interactive Prototyping, User Research, User Interviews, Usability Testing, Responsive Design, Accessibility, Design Systems, Component Libraries, Design Tokens, Developer Handoff, Figma, FigJam, ProtoPie, Adobe Photoshop, Adobe Illustrator, ChatGPT, Claude, Codex.</w:t>
       </w:r>
@@ -858,12 +858,12 @@
     <w:qFormat/>
     <w:rsid w:val="00FC693F"/>
     <w:pPr>
-      <w:spacing w:after="48" w:line="250" w:lineRule="auto"/>
+      <w:spacing w:after="60" w:line="254" w:lineRule="auto"/>
     </w:pPr>
     <w:rPr>
       <w:rFonts w:ascii="Arial" w:hAnsi="Arial"/>
       <w:color w:val="000000"/>
-      <w:sz w:val="19"/>
+      <w:sz w:val="20"/>
     </w:rPr>
   </w:style>
   <w:style w:type="paragraph" w:styleId="Header">
@@ -933,7 +933,7 @@
     <w:pPr>
       <w:keepNext/>
       <w:keepLines/>
-      <w:spacing w:before="160" w:after="60"/>
+      <w:spacing w:before="180" w:after="80"/>
       <w:outlineLvl w:val="0"/>
     </w:pPr>
     <w:rPr>
@@ -941,7 +941,7 @@
       <w:b/>
       <w:bCs/>
       <w:color w:val="000000"/>
-      <w:sz w:val="23"/>
+      <w:sz w:val="24"/>
       <w:szCs w:val="28"/>
     </w:rPr>
   </w:style>
@@ -1228,7 +1228,7 @@
     <w:qFormat/>
     <w:rsid w:val="00FC693F"/>
     <w:pPr>
-      <w:spacing w:after="40" w:line="240" w:lineRule="auto"/>
+      <w:spacing w:after="60" w:line="240" w:lineRule="auto"/>
       <w:contextualSpacing/>
     </w:pPr>
     <w:rPr>
@@ -1237,7 +1237,7 @@
       <w:color w:val="000000"/>
       <w:spacing w:val="5"/>
       <w:kern w:val="28"/>
-      <w:sz w:val="50"/>
+      <w:sz w:val="54"/>
       <w:szCs w:val="52"/>
     </w:rPr>
   </w:style>
@@ -1437,14 +1437,14 @@
       <w:numPr>
         <w:numId w:val="1"/>
       </w:numPr>
-      <w:spacing w:after="32" w:line="245" w:lineRule="auto"/>
+      <w:spacing w:after="44" w:line="250" w:lineRule="auto"/>
       <w:ind w:left="288" w:hanging="187"/>
       <w:contextualSpacing/>
     </w:pPr>
     <w:rPr>
       <w:rFonts w:ascii="Arial" w:hAnsi="Arial"/>
       <w:color w:val="000000"/>
-      <w:sz w:val="19"/>
+      <w:sz w:val="20"/>
     </w:rPr>
   </w:style>
   <w:style w:type="paragraph" w:styleId="ListBullet2">
@@ -12814,13 +12814,13 @@
     <w:name w:val="Role"/>
     <w:pPr>
       <w:keepNext/>
-      <w:spacing w:before="100" w:after="20"/>
+      <w:spacing w:before="130" w:after="30"/>
     </w:pPr>
     <w:rPr>
       <w:rFonts w:ascii="Arial" w:hAnsi="Arial"/>
       <w:b/>
       <w:color w:val="000000"/>
-      <w:sz w:val="20"/>
+      <w:sz w:val="21"/>
     </w:rPr>
   </w:style>
 </w:styles>

</xml_diff>